<commit_message>
feat: arifmetics exam + rgr
</commit_message>
<xml_diff>
--- a/Арифметические и логические основы вычислительных систем/РГР.docx
+++ b/Арифметические и логические основы вычислительных систем/РГР.docx
@@ -619,6 +619,7 @@
         </w:rPr>
         <w:t xml:space="preserve"> загружа</w:t>
       </w:r>
+      <w:proofErr w:type="spellStart"/>
       <w:r>
         <w:rPr>
           <w:rFonts w:ascii="Times New Roman" w:hAnsi="Times New Roman" w:cs="Times New Roman"/>
@@ -627,6 +628,7 @@
         </w:rPr>
         <w:t>ется</w:t>
       </w:r>
+      <w:proofErr w:type="spellEnd"/>
       <w:r>
         <w:rPr>
           <w:rFonts w:ascii="Times New Roman" w:hAnsi="Times New Roman" w:cs="Times New Roman"/>
@@ -755,7 +757,25 @@
           <w:sz w:val="28"/>
           <w:szCs w:val="28"/>
         </w:rPr>
-        <w:t>, выполнение этой операции предполагается на некотором дополнительном сумматоре. Поскольку предполагается, что данные хранятся в прямом коде, то знаки операндов следует обработать отдельно и сохранить в триггере, то есть выполняется операция определения знака результата и сохранения его в триггере</w:t>
+        <w:t>, выполнение этой операции предполагается на некотором дополнительном сумматоре. Поскольку предполагается, что данные хранятся в прямом коде, то знаки операндов сл</w:t>
+      </w:r>
+      <w:proofErr w:type="spellStart"/>
+      <w:r>
+        <w:rPr>
+          <w:rFonts w:ascii="Times New Roman" w:hAnsi="Times New Roman" w:cs="Times New Roman"/>
+          <w:sz w:val="28"/>
+          <w:szCs w:val="28"/>
+        </w:rPr>
+        <w:t>едует</w:t>
+      </w:r>
+      <w:proofErr w:type="spellEnd"/>
+      <w:r>
+        <w:rPr>
+          <w:rFonts w:ascii="Times New Roman" w:hAnsi="Times New Roman" w:cs="Times New Roman"/>
+          <w:sz w:val="28"/>
+          <w:szCs w:val="28"/>
+        </w:rPr>
+        <w:t xml:space="preserve"> обработать отдельно и сохранить в триггере, то есть выполняется операция определения знака результата и сохранения его в триггере</w:t>
       </w:r>
       <w:r>
         <w:rPr>
@@ -1237,7 +1257,25 @@
           <w:sz w:val="28"/>
           <w:szCs w:val="28"/>
         </w:rPr>
-        <w:t xml:space="preserve"> в сторону старших разрядов, </w:t>
+        <w:t xml:space="preserve"> в сторону старших разряд</w:t>
+      </w:r>
+      <w:proofErr w:type="spellStart"/>
+      <w:r>
+        <w:rPr>
+          <w:rFonts w:ascii="Times New Roman" w:hAnsi="Times New Roman" w:cs="Times New Roman"/>
+          <w:sz w:val="28"/>
+          <w:szCs w:val="28"/>
+        </w:rPr>
+        <w:t>ов</w:t>
+      </w:r>
+      <w:proofErr w:type="spellEnd"/>
+      <w:r>
+        <w:rPr>
+          <w:rFonts w:ascii="Times New Roman" w:hAnsi="Times New Roman" w:cs="Times New Roman"/>
+          <w:sz w:val="28"/>
+          <w:szCs w:val="28"/>
+        </w:rPr>
+        <w:t xml:space="preserve">, </w:t>
       </w:r>
       <m:oMath>
         <m:r>
@@ -1287,15 +1325,7 @@
             <w:sz w:val="28"/>
             <w:szCs w:val="28"/>
           </w:rPr>
-          <m:t>СТ</m:t>
-        </m:r>
-        <m:r>
-          <w:rPr>
-            <w:rFonts w:ascii="Cambria Math" w:hAnsi="Cambria Math" w:cs="Times New Roman"/>
-            <w:sz w:val="28"/>
-            <w:szCs w:val="28"/>
-          </w:rPr>
-          <m:t>=СТ-1</m:t>
+          <m:t>СТ=СТ-1</m:t>
         </m:r>
       </m:oMath>
       <w:r>
@@ -1617,16 +1647,7 @@
               <w:szCs w:val="28"/>
               <w:lang w:val="en-US"/>
             </w:rPr>
-            <m:t>A=0,1101110</m:t>
-          </m:r>
-          <m:r>
-            <w:rPr>
-              <w:rFonts w:ascii="Cambria Math" w:hAnsi="Cambria Math" w:cs="Times New Roman"/>
-              <w:sz w:val="28"/>
-              <w:szCs w:val="28"/>
-              <w:lang w:val="en-US"/>
-            </w:rPr>
-            <m:t>0</m:t>
+            <m:t>A=0,11011100</m:t>
           </m:r>
         </m:oMath>
       </m:oMathPara>
@@ -1654,16 +1675,7 @@
               <w:szCs w:val="28"/>
               <w:lang w:val="en-US"/>
             </w:rPr>
-            <m:t>B=0,1101001</m:t>
-          </m:r>
-          <m:r>
-            <w:rPr>
-              <w:rFonts w:ascii="Cambria Math" w:hAnsi="Cambria Math" w:cs="Times New Roman"/>
-              <w:sz w:val="28"/>
-              <w:szCs w:val="28"/>
-              <w:lang w:val="en-US"/>
-            </w:rPr>
-            <m:t>0</m:t>
+            <m:t>B=0,11010010</m:t>
           </m:r>
         </m:oMath>
       </m:oMathPara>
@@ -1719,16 +1731,7 @@
               <w:szCs w:val="28"/>
               <w:lang w:val="en-US"/>
             </w:rPr>
-            <m:t>R2=0,1101110</m:t>
-          </m:r>
-          <m:r>
-            <w:rPr>
-              <w:rFonts w:ascii="Cambria Math" w:hAnsi="Cambria Math" w:cs="Times New Roman"/>
-              <w:sz w:val="28"/>
-              <w:szCs w:val="28"/>
-              <w:lang w:val="en-US"/>
-            </w:rPr>
-            <m:t>0</m:t>
+            <m:t>R2=0,11011100</m:t>
           </m:r>
         </m:oMath>
       </m:oMathPara>
@@ -1756,25 +1759,7 @@
               <w:szCs w:val="28"/>
               <w:lang w:val="en-US"/>
             </w:rPr>
-            <m:t>Σ</m:t>
-          </m:r>
-          <m:r>
-            <w:rPr>
-              <w:rFonts w:ascii="Cambria Math" w:hAnsi="Cambria Math" w:cs="Times New Roman"/>
-              <w:sz w:val="28"/>
-              <w:szCs w:val="28"/>
-              <w:lang w:val="en-US"/>
-            </w:rPr>
-            <m:t>=</m:t>
-          </m:r>
-          <m:r>
-            <w:rPr>
-              <w:rFonts w:ascii="Cambria Math" w:hAnsi="Cambria Math" w:cs="Times New Roman"/>
-              <w:sz w:val="28"/>
-              <w:szCs w:val="28"/>
-              <w:lang w:val="en-US"/>
-            </w:rPr>
-            <m:t>0</m:t>
+            <m:t>Σ=0</m:t>
           </m:r>
         </m:oMath>
       </m:oMathPara>
@@ -1821,16 +1806,7 @@
               <w:szCs w:val="28"/>
               <w:lang w:val="en-US"/>
             </w:rPr>
-            <m:t>pA=0001</m:t>
-          </m:r>
-          <m:r>
-            <w:rPr>
-              <w:rFonts w:ascii="Cambria Math" w:hAnsi="Cambria Math" w:cs="Times New Roman"/>
-              <w:sz w:val="28"/>
-              <w:szCs w:val="28"/>
-              <w:lang w:val="en-US"/>
-            </w:rPr>
-            <m:t>0</m:t>
+            <m:t>pA=00010</m:t>
           </m:r>
         </m:oMath>
       </m:oMathPara>
@@ -1857,16 +1833,7 @@
               <w:szCs w:val="28"/>
               <w:lang w:val="en-US"/>
             </w:rPr>
-            <m:t>pB=0001</m:t>
-          </m:r>
-          <m:r>
-            <w:rPr>
-              <w:rFonts w:ascii="Cambria Math" w:hAnsi="Cambria Math" w:cs="Times New Roman"/>
-              <w:sz w:val="28"/>
-              <w:szCs w:val="28"/>
-              <w:lang w:val="en-US"/>
-            </w:rPr>
-            <m:t>1</m:t>
+            <m:t>pB=00011</m:t>
           </m:r>
         </m:oMath>
       </m:oMathPara>
@@ -2066,34 +2033,7 @@
               <w:szCs w:val="28"/>
               <w:lang w:val="en-US"/>
             </w:rPr>
-            <m:t>Σ</m:t>
-          </m:r>
-          <m:r>
-            <w:rPr>
-              <w:rFonts w:ascii="Cambria Math" w:hAnsi="Cambria Math" w:cs="Times New Roman"/>
-              <w:sz w:val="28"/>
-              <w:szCs w:val="28"/>
-              <w:lang w:val="en-US"/>
-            </w:rPr>
-            <m:t>=</m:t>
-          </m:r>
-          <m:r>
-            <w:rPr>
-              <w:rFonts w:ascii="Cambria Math" w:hAnsi="Cambria Math" w:cs="Times New Roman"/>
-              <w:sz w:val="28"/>
-              <w:szCs w:val="28"/>
-              <w:lang w:val="en-US"/>
-            </w:rPr>
-            <m:t>Σ</m:t>
-          </m:r>
-          <m:r>
-            <w:rPr>
-              <w:rFonts w:ascii="Cambria Math" w:hAnsi="Cambria Math" w:cs="Times New Roman"/>
-              <w:sz w:val="28"/>
-              <w:szCs w:val="28"/>
-              <w:lang w:val="en-US"/>
-            </w:rPr>
-            <m:t>+R2=0,01101110</m:t>
+            <m:t>Σ=Σ+R2=0,01101110</m:t>
           </m:r>
           <m:d>
             <m:dPr>
@@ -2467,34 +2407,7 @@
               <w:szCs w:val="28"/>
               <w:lang w:val="en-US"/>
             </w:rPr>
-            <m:t>Σ</m:t>
-          </m:r>
-          <m:r>
-            <w:rPr>
-              <w:rFonts w:ascii="Cambria Math" w:hAnsi="Cambria Math" w:cs="Times New Roman"/>
-              <w:sz w:val="28"/>
-              <w:szCs w:val="28"/>
-              <w:lang w:val="en-US"/>
-            </w:rPr>
-            <m:t>=</m:t>
-          </m:r>
-          <m:r>
-            <w:rPr>
-              <w:rFonts w:ascii="Cambria Math" w:hAnsi="Cambria Math" w:cs="Times New Roman"/>
-              <w:sz w:val="28"/>
-              <w:szCs w:val="28"/>
-              <w:lang w:val="en-US"/>
-            </w:rPr>
-            <m:t>Σ</m:t>
-          </m:r>
-          <m:r>
-            <w:rPr>
-              <w:rFonts w:ascii="Cambria Math" w:hAnsi="Cambria Math" w:cs="Times New Roman"/>
-              <w:sz w:val="28"/>
-              <w:szCs w:val="28"/>
-              <w:lang w:val="en-US"/>
-            </w:rPr>
-            <m:t>+R2=0,01101110</m:t>
+            <m:t>Σ=Σ+R2=0,01101110</m:t>
           </m:r>
           <m:d>
             <m:dPr>
@@ -3104,34 +3017,7 @@
               <w:szCs w:val="28"/>
               <w:lang w:val="en-US"/>
             </w:rPr>
-            <m:t>Σ</m:t>
-          </m:r>
-          <m:r>
-            <w:rPr>
-              <w:rFonts w:ascii="Cambria Math" w:hAnsi="Cambria Math" w:cs="Times New Roman"/>
-              <w:sz w:val="28"/>
-              <w:szCs w:val="28"/>
-              <w:lang w:val="en-US"/>
-            </w:rPr>
-            <m:t>=</m:t>
-          </m:r>
-          <m:r>
-            <w:rPr>
-              <w:rFonts w:ascii="Cambria Math" w:hAnsi="Cambria Math" w:cs="Times New Roman"/>
-              <w:sz w:val="28"/>
-              <w:szCs w:val="28"/>
-              <w:lang w:val="en-US"/>
-            </w:rPr>
-            <m:t>Σ</m:t>
-          </m:r>
-          <m:r>
-            <w:rPr>
-              <w:rFonts w:ascii="Cambria Math" w:hAnsi="Cambria Math" w:cs="Times New Roman"/>
-              <w:sz w:val="28"/>
-              <w:szCs w:val="28"/>
-              <w:lang w:val="en-US"/>
-            </w:rPr>
-            <m:t>+R2=0,10001001</m:t>
+            <m:t>Σ=Σ+R2=0,10001001</m:t>
           </m:r>
           <m:d>
             <m:dPr>
@@ -3201,25 +3087,7 @@
               <w:szCs w:val="28"/>
               <w:lang w:val="en-US"/>
             </w:rPr>
-            <m:t>=0,10001</m:t>
-          </m:r>
-          <m:r>
-            <w:rPr>
-              <w:rFonts w:ascii="Cambria Math" w:hAnsi="Cambria Math" w:cs="Times New Roman"/>
-              <w:sz w:val="28"/>
-              <w:szCs w:val="28"/>
-              <w:lang w:val="en-US"/>
-            </w:rPr>
-            <m:t>1</m:t>
-          </m:r>
-          <m:r>
-            <w:rPr>
-              <w:rFonts w:ascii="Cambria Math" w:hAnsi="Cambria Math" w:cs="Times New Roman"/>
-              <w:sz w:val="28"/>
-              <w:szCs w:val="28"/>
-              <w:lang w:val="en-US"/>
-            </w:rPr>
-            <m:t>00</m:t>
+            <m:t>=0,10001100</m:t>
           </m:r>
           <m:d>
             <m:dPr>
@@ -3243,16 +3111,7 @@
                   <w:szCs w:val="28"/>
                   <w:lang w:val="en-US"/>
                 </w:rPr>
-                <m:t>1</m:t>
-              </m:r>
-              <m:r>
-                <w:rPr>
-                  <w:rFonts w:ascii="Cambria Math" w:hAnsi="Cambria Math" w:cs="Times New Roman"/>
-                  <w:sz w:val="28"/>
-                  <w:szCs w:val="28"/>
-                  <w:lang w:val="en-US"/>
-                </w:rPr>
-                <m:t>11</m:t>
+                <m:t>111</m:t>
               </m:r>
             </m:e>
           </m:d>
@@ -3615,34 +3474,7 @@
             <w:szCs w:val="28"/>
             <w:lang w:val="en-US"/>
           </w:rPr>
-          <m:t>Σ</m:t>
-        </m:r>
-        <m:r>
-          <w:rPr>
-            <w:rFonts w:ascii="Cambria Math" w:hAnsi="Cambria Math" w:cs="Times New Roman"/>
-            <w:sz w:val="28"/>
-            <w:szCs w:val="28"/>
-            <w:lang w:val="en-US"/>
-          </w:rPr>
-          <m:t>=</m:t>
-        </m:r>
-        <m:r>
-          <w:rPr>
-            <w:rFonts w:ascii="Cambria Math" w:hAnsi="Cambria Math" w:cs="Times New Roman"/>
-            <w:sz w:val="28"/>
-            <w:szCs w:val="28"/>
-            <w:lang w:val="en-US"/>
-          </w:rPr>
-          <m:t>Σ</m:t>
-        </m:r>
-        <m:r>
-          <w:rPr>
-            <w:rFonts w:ascii="Cambria Math" w:hAnsi="Cambria Math" w:cs="Times New Roman"/>
-            <w:sz w:val="28"/>
-            <w:szCs w:val="28"/>
-            <w:lang w:val="en-US"/>
-          </w:rPr>
-          <m:t>+0,00000000</m:t>
+          <m:t>Σ=Σ+0,00000000</m:t>
         </m:r>
         <m:d>
           <m:dPr>
@@ -3677,16 +3509,7 @@
             <w:szCs w:val="28"/>
             <w:lang w:val="en-US"/>
           </w:rPr>
-          <m:t>=</m:t>
-        </m:r>
-        <m:r>
-          <w:rPr>
-            <w:rFonts w:ascii="Cambria Math" w:hAnsi="Cambria Math" w:cs="Times New Roman"/>
-            <w:sz w:val="28"/>
-            <w:szCs w:val="28"/>
-            <w:lang w:val="en-US"/>
-          </w:rPr>
-          <m:t>0,10001100</m:t>
+          <m:t>=0,10001100</m:t>
         </m:r>
         <m:d>
           <m:dPr>
@@ -3721,16 +3544,7 @@
             <w:szCs w:val="28"/>
             <w:lang w:val="en-US"/>
           </w:rPr>
-          <m:t>+</m:t>
-        </m:r>
-        <m:r>
-          <w:rPr>
-            <w:rFonts w:ascii="Cambria Math" w:hAnsi="Cambria Math" w:cs="Times New Roman"/>
-            <w:sz w:val="28"/>
-            <w:szCs w:val="28"/>
-            <w:lang w:val="en-US"/>
-          </w:rPr>
-          <m:t>0,00000000</m:t>
+          <m:t>+0,00000000</m:t>
         </m:r>
         <m:d>
           <m:dPr>
@@ -3835,16 +3649,7 @@
               <w:szCs w:val="28"/>
               <w:lang w:val="en-US"/>
             </w:rPr>
-            <m:t>pC=pA+pB=0010</m:t>
-          </m:r>
-          <m:r>
-            <w:rPr>
-              <w:rFonts w:ascii="Cambria Math" w:hAnsi="Cambria Math" w:cs="Times New Roman"/>
-              <w:sz w:val="28"/>
-              <w:szCs w:val="28"/>
-              <w:lang w:val="en-US"/>
-            </w:rPr>
-            <m:t>1</m:t>
+            <m:t>pC=pA+pB=00101</m:t>
           </m:r>
         </m:oMath>
       </m:oMathPara>
@@ -3876,25 +3681,7 @@
             <w:szCs w:val="28"/>
             <w:lang w:val="en-US"/>
           </w:rPr>
-          <m:t>Σ</m:t>
-        </m:r>
-        <m:r>
-          <w:rPr>
-            <w:rFonts w:ascii="Cambria Math" w:hAnsi="Cambria Math" w:cs="Times New Roman"/>
-            <w:sz w:val="28"/>
-            <w:szCs w:val="28"/>
-            <w:lang w:val="en-US"/>
-          </w:rPr>
-          <m:t>=0,1000110</m:t>
-        </m:r>
-        <m:r>
-          <w:rPr>
-            <w:rFonts w:ascii="Cambria Math" w:hAnsi="Cambria Math" w:cs="Times New Roman"/>
-            <w:sz w:val="28"/>
-            <w:szCs w:val="28"/>
-            <w:lang w:val="en-US"/>
-          </w:rPr>
-          <m:t>1</m:t>
+          <m:t>Σ=0,10001101</m:t>
         </m:r>
       </m:oMath>
       <w:r>
@@ -4012,16 +3799,7 @@
               <w:szCs w:val="28"/>
               <w:lang w:val="en-US"/>
             </w:rPr>
-            <m:t>A=0,</m:t>
-          </m:r>
-          <m:r>
-            <w:rPr>
-              <w:rFonts w:ascii="Cambria Math" w:hAnsi="Cambria Math" w:cs="Times New Roman"/>
-              <w:sz w:val="28"/>
-              <w:szCs w:val="28"/>
-              <w:lang w:val="en-US"/>
-            </w:rPr>
-            <m:t>10100101</m:t>
+            <m:t>A=0,10100101</m:t>
           </m:r>
         </m:oMath>
       </m:oMathPara>
@@ -4049,16 +3827,7 @@
               <w:szCs w:val="28"/>
               <w:lang w:val="en-US"/>
             </w:rPr>
-            <m:t>B=0,1</m:t>
-          </m:r>
-          <m:r>
-            <w:rPr>
-              <w:rFonts w:ascii="Cambria Math" w:hAnsi="Cambria Math" w:cs="Times New Roman"/>
-              <w:sz w:val="28"/>
-              <w:szCs w:val="28"/>
-              <w:lang w:val="en-US"/>
-            </w:rPr>
-            <m:t>0001010</m:t>
+            <m:t>B=0,10001010</m:t>
           </m:r>
         </m:oMath>
       </m:oMathPara>
@@ -4086,16 +3855,7 @@
               <w:szCs w:val="28"/>
               <w:lang w:val="en-US"/>
             </w:rPr>
-            <m:t>R1=0,1</m:t>
-          </m:r>
-          <m:r>
-            <w:rPr>
-              <w:rFonts w:ascii="Cambria Math" w:hAnsi="Cambria Math" w:cs="Times New Roman"/>
-              <w:sz w:val="28"/>
-              <w:szCs w:val="28"/>
-              <w:lang w:val="en-US"/>
-            </w:rPr>
-            <m:t>0001010</m:t>
+            <m:t>R1=0,10001010</m:t>
           </m:r>
         </m:oMath>
       </m:oMathPara>
@@ -4123,16 +3883,7 @@
               <w:szCs w:val="28"/>
               <w:lang w:val="en-US"/>
             </w:rPr>
-            <m:t>R2=0,1</m:t>
-          </m:r>
-          <m:r>
-            <w:rPr>
-              <w:rFonts w:ascii="Cambria Math" w:hAnsi="Cambria Math" w:cs="Times New Roman"/>
-              <w:sz w:val="28"/>
-              <w:szCs w:val="28"/>
-              <w:lang w:val="en-US"/>
-            </w:rPr>
-            <m:t>0100101</m:t>
+            <m:t>R2=0,10100101</m:t>
           </m:r>
         </m:oMath>
       </m:oMathPara>
@@ -4160,25 +3911,7 @@
               <w:szCs w:val="28"/>
               <w:lang w:val="en-US"/>
             </w:rPr>
-            <m:t>Σ</m:t>
-          </m:r>
-          <m:r>
-            <w:rPr>
-              <w:rFonts w:ascii="Cambria Math" w:hAnsi="Cambria Math" w:cs="Times New Roman"/>
-              <w:sz w:val="28"/>
-              <w:szCs w:val="28"/>
-              <w:lang w:val="en-US"/>
-            </w:rPr>
-            <m:t>=</m:t>
-          </m:r>
-          <m:r>
-            <w:rPr>
-              <w:rFonts w:ascii="Cambria Math" w:hAnsi="Cambria Math" w:cs="Times New Roman"/>
-              <w:sz w:val="28"/>
-              <w:szCs w:val="28"/>
-              <w:lang w:val="en-US"/>
-            </w:rPr>
-            <m:t>0</m:t>
+            <m:t>Σ=0</m:t>
           </m:r>
         </m:oMath>
       </m:oMathPara>
@@ -4225,25 +3958,7 @@
               <w:szCs w:val="28"/>
               <w:lang w:val="en-US"/>
             </w:rPr>
-            <m:t>pA=000</m:t>
-          </m:r>
-          <m:r>
-            <w:rPr>
-              <w:rFonts w:ascii="Cambria Math" w:hAnsi="Cambria Math" w:cs="Times New Roman"/>
-              <w:sz w:val="28"/>
-              <w:szCs w:val="28"/>
-              <w:lang w:val="en-US"/>
-            </w:rPr>
-            <m:t>0</m:t>
-          </m:r>
-          <m:r>
-            <w:rPr>
-              <w:rFonts w:ascii="Cambria Math" w:hAnsi="Cambria Math" w:cs="Times New Roman"/>
-              <w:sz w:val="28"/>
-              <w:szCs w:val="28"/>
-              <w:lang w:val="en-US"/>
-            </w:rPr>
-            <m:t>1</m:t>
+            <m:t>pA=00001</m:t>
           </m:r>
         </m:oMath>
       </m:oMathPara>
@@ -4270,16 +3985,7 @@
               <w:szCs w:val="28"/>
               <w:lang w:val="en-US"/>
             </w:rPr>
-            <m:t>pB=0001</m:t>
-          </m:r>
-          <m:r>
-            <w:rPr>
-              <w:rFonts w:ascii="Cambria Math" w:hAnsi="Cambria Math" w:cs="Times New Roman"/>
-              <w:sz w:val="28"/>
-              <w:szCs w:val="28"/>
-              <w:lang w:val="en-US"/>
-            </w:rPr>
-            <m:t>0</m:t>
+            <m:t>pB=00010</m:t>
           </m:r>
         </m:oMath>
       </m:oMathPara>
@@ -4351,16 +4057,7 @@
             <w:szCs w:val="28"/>
             <w:lang w:val="en-US"/>
           </w:rPr>
-          <m:t>=0,01</m:t>
-        </m:r>
-        <m:r>
-          <w:rPr>
-            <w:rFonts w:ascii="Cambria Math" w:hAnsi="Cambria Math" w:cs="Times New Roman"/>
-            <w:sz w:val="28"/>
-            <w:szCs w:val="28"/>
-            <w:lang w:val="en-US"/>
-          </w:rPr>
-          <m:t>010010</m:t>
+          <m:t>=0,01010010</m:t>
         </m:r>
         <m:d>
           <m:dPr>
@@ -4384,16 +4081,7 @@
                 <w:szCs w:val="28"/>
                 <w:lang w:val="en-US"/>
               </w:rPr>
-              <m:t>1</m:t>
-            </m:r>
-            <m:r>
-              <w:rPr>
-                <w:rFonts w:ascii="Cambria Math" w:hAnsi="Cambria Math" w:cs="Times New Roman"/>
-                <w:sz w:val="28"/>
-                <w:szCs w:val="28"/>
-                <w:lang w:val="en-US"/>
-              </w:rPr>
-              <m:t>00</m:t>
+              <m:t>100</m:t>
             </m:r>
           </m:e>
         </m:d>
@@ -4535,16 +4223,7 @@
             <w:szCs w:val="28"/>
             <w:lang w:val="en-US"/>
           </w:rPr>
-          <m:t>=0,001</m:t>
-        </m:r>
-        <m:r>
-          <w:rPr>
-            <w:rFonts w:ascii="Cambria Math" w:hAnsi="Cambria Math" w:cs="Times New Roman"/>
-            <w:sz w:val="28"/>
-            <w:szCs w:val="28"/>
-            <w:lang w:val="en-US"/>
-          </w:rPr>
-          <m:t>01001</m:t>
+          <m:t>=0,00101001</m:t>
         </m:r>
         <m:d>
           <m:dPr>
@@ -4568,218 +4247,7 @@
                 <w:szCs w:val="28"/>
                 <w:lang w:val="en-US"/>
               </w:rPr>
-              <m:t>01</m:t>
-            </m:r>
-            <m:r>
-              <w:rPr>
-                <w:rFonts w:ascii="Cambria Math" w:hAnsi="Cambria Math" w:cs="Times New Roman"/>
-                <w:sz w:val="28"/>
-                <w:szCs w:val="28"/>
-                <w:lang w:val="en-US"/>
-              </w:rPr>
-              <m:t>0</m:t>
-            </m:r>
-          </m:e>
-        </m:d>
-      </m:oMath>
-      <w:r>
-        <w:rPr>
-          <w:rFonts w:ascii="Times New Roman" w:hAnsi="Times New Roman" w:cs="Times New Roman"/>
-          <w:sz w:val="28"/>
-          <w:szCs w:val="28"/>
-          <w:lang w:val="en-US"/>
-        </w:rPr>
-        <w:t xml:space="preserve"> </w:t>
-      </w:r>
-      <m:oMath>
-        <m:acc>
-          <m:accPr>
-            <m:chr m:val="⃖"/>
-            <m:ctrlPr>
-              <w:rPr>
-                <w:rFonts w:ascii="Cambria Math" w:hAnsi="Cambria Math" w:cs="Times New Roman"/>
-                <w:i/>
-                <w:sz w:val="28"/>
-                <w:szCs w:val="28"/>
-                <w:lang w:val="en-US"/>
-              </w:rPr>
-            </m:ctrlPr>
-          </m:accPr>
-          <m:e>
-            <m:r>
-              <w:rPr>
-                <w:rFonts w:ascii="Cambria Math" w:hAnsi="Cambria Math" w:cs="Times New Roman"/>
-                <w:sz w:val="28"/>
-                <w:szCs w:val="28"/>
-                <w:lang w:val="en-US"/>
-              </w:rPr>
-              <m:t>R1</m:t>
-            </m:r>
-          </m:e>
-        </m:acc>
-        <m:r>
-          <w:rPr>
-            <w:rFonts w:ascii="Cambria Math" w:hAnsi="Cambria Math" w:cs="Times New Roman"/>
-            <w:sz w:val="28"/>
-            <w:szCs w:val="28"/>
-            <w:lang w:val="en-US"/>
-          </w:rPr>
-          <m:t>=</m:t>
-        </m:r>
-        <m:r>
-          <w:rPr>
-            <w:rFonts w:ascii="Cambria Math" w:hAnsi="Cambria Math" w:cs="Times New Roman"/>
-            <w:sz w:val="28"/>
-            <w:szCs w:val="28"/>
-            <w:lang w:val="en-US"/>
-          </w:rPr>
-          <m:t>0</m:t>
-        </m:r>
-        <m:r>
-          <w:rPr>
-            <w:rFonts w:ascii="Cambria Math" w:hAnsi="Cambria Math" w:cs="Times New Roman"/>
-            <w:sz w:val="28"/>
-            <w:szCs w:val="28"/>
-            <w:lang w:val="en-US"/>
-          </w:rPr>
-          <m:t>,</m:t>
-        </m:r>
-        <m:bar>
-          <m:barPr>
-            <m:ctrlPr>
-              <w:rPr>
-                <w:rFonts w:ascii="Cambria Math" w:hAnsi="Cambria Math" w:cs="Times New Roman"/>
-                <w:i/>
-                <w:sz w:val="28"/>
-                <w:szCs w:val="28"/>
-                <w:lang w:val="en-US"/>
-              </w:rPr>
-            </m:ctrlPr>
-          </m:barPr>
-          <m:e>
-            <m:r>
-              <w:rPr>
-                <w:rFonts w:ascii="Cambria Math" w:hAnsi="Cambria Math" w:cs="Times New Roman"/>
-                <w:sz w:val="28"/>
-                <w:szCs w:val="28"/>
-                <w:lang w:val="en-US"/>
-              </w:rPr>
-              <m:t>0</m:t>
-            </m:r>
-          </m:e>
-        </m:bar>
-        <m:r>
-          <w:rPr>
-            <w:rFonts w:ascii="Cambria Math" w:hAnsi="Cambria Math" w:cs="Times New Roman"/>
-            <w:sz w:val="28"/>
-            <w:szCs w:val="28"/>
-            <w:lang w:val="en-US"/>
-          </w:rPr>
-          <m:t>0101000</m:t>
-        </m:r>
-      </m:oMath>
-      <w:r>
-        <w:rPr>
-          <w:rFonts w:ascii="Times New Roman" w:hAnsi="Times New Roman" w:cs="Times New Roman"/>
-          <w:sz w:val="28"/>
-          <w:szCs w:val="28"/>
-          <w:lang w:val="en-US"/>
-        </w:rPr>
-        <w:br/>
-      </w:r>
-    </w:p>
-    <w:p>
-      <w:pPr>
-        <w:pStyle w:val="a7"/>
-        <w:numPr>
-          <w:ilvl w:val="0"/>
-          <w:numId w:val="4"/>
-        </w:numPr>
-        <w:ind w:left="426" w:hanging="426"/>
-        <w:jc w:val="both"/>
-        <w:rPr>
-          <w:rFonts w:ascii="Times New Roman" w:hAnsi="Times New Roman" w:cs="Times New Roman"/>
-          <w:sz w:val="28"/>
-          <w:szCs w:val="28"/>
-          <w:lang w:val="en-US"/>
-        </w:rPr>
-      </w:pPr>
-      <m:oMath>
-        <m:acc>
-          <m:accPr>
-            <m:chr m:val="⃗"/>
-            <m:ctrlPr>
-              <w:rPr>
-                <w:rFonts w:ascii="Cambria Math" w:hAnsi="Cambria Math" w:cs="Times New Roman"/>
-                <w:i/>
-                <w:sz w:val="28"/>
-                <w:szCs w:val="28"/>
-                <w:lang w:val="en-US"/>
-              </w:rPr>
-            </m:ctrlPr>
-          </m:accPr>
-          <m:e>
-            <m:r>
-              <w:rPr>
-                <w:rFonts w:ascii="Cambria Math" w:hAnsi="Cambria Math" w:cs="Times New Roman"/>
-                <w:sz w:val="28"/>
-                <w:szCs w:val="28"/>
-                <w:lang w:val="en-US"/>
-              </w:rPr>
-              <m:t>R2</m:t>
-            </m:r>
-          </m:e>
-        </m:acc>
-        <m:r>
-          <w:rPr>
-            <w:rFonts w:ascii="Cambria Math" w:hAnsi="Cambria Math" w:cs="Times New Roman"/>
-            <w:sz w:val="28"/>
-            <w:szCs w:val="28"/>
-            <w:lang w:val="en-US"/>
-          </w:rPr>
-          <m:t>=0,000</m:t>
-        </m:r>
-        <m:r>
-          <w:rPr>
-            <w:rFonts w:ascii="Cambria Math" w:hAnsi="Cambria Math" w:cs="Times New Roman"/>
-            <w:sz w:val="28"/>
-            <w:szCs w:val="28"/>
-            <w:lang w:val="en-US"/>
-          </w:rPr>
-          <m:t>10100</m:t>
-        </m:r>
-        <m:d>
-          <m:dPr>
-            <m:begChr m:val="|"/>
-            <m:endChr m:val=""/>
-            <m:ctrlPr>
-              <w:rPr>
-                <w:rFonts w:ascii="Cambria Math" w:hAnsi="Cambria Math" w:cs="Times New Roman"/>
-                <w:i/>
-                <w:sz w:val="28"/>
-                <w:szCs w:val="28"/>
-                <w:lang w:val="en-US"/>
-              </w:rPr>
-            </m:ctrlPr>
-          </m:dPr>
-          <m:e>
-            <m:r>
-              <w:rPr>
-                <w:rFonts w:ascii="Cambria Math" w:hAnsi="Cambria Math" w:cs="Times New Roman"/>
-                <w:sz w:val="28"/>
-                <w:szCs w:val="28"/>
-                <w:lang w:val="en-US"/>
-              </w:rPr>
-              <m:t>10</m:t>
-            </m:r>
-            <m:r>
-              <w:rPr>
-                <w:rFonts w:ascii="Cambria Math" w:hAnsi="Cambria Math" w:cs="Times New Roman"/>
-                <w:sz w:val="28"/>
-                <w:szCs w:val="28"/>
-                <w:lang w:val="en-US"/>
-              </w:rPr>
-              <m:t>1</m:t>
+              <m:t>010</m:t>
             </m:r>
           </m:e>
         </m:d>
@@ -4859,16 +4327,7 @@
             <w:szCs w:val="28"/>
             <w:lang w:val="en-US"/>
           </w:rPr>
-          <m:t>101</m:t>
-        </m:r>
-        <m:r>
-          <w:rPr>
-            <w:rFonts w:ascii="Cambria Math" w:hAnsi="Cambria Math" w:cs="Times New Roman"/>
-            <w:sz w:val="28"/>
-            <w:szCs w:val="28"/>
-            <w:lang w:val="en-US"/>
-          </w:rPr>
-          <m:t>0000</m:t>
+          <m:t>0101000</m:t>
         </m:r>
       </m:oMath>
       <w:r>
@@ -4930,25 +4389,7 @@
             <w:szCs w:val="28"/>
             <w:lang w:val="en-US"/>
           </w:rPr>
-          <m:t>=0,00001</m:t>
-        </m:r>
-        <m:r>
-          <w:rPr>
-            <w:rFonts w:ascii="Cambria Math" w:hAnsi="Cambria Math" w:cs="Times New Roman"/>
-            <w:sz w:val="28"/>
-            <w:szCs w:val="28"/>
-            <w:lang w:val="en-US"/>
-          </w:rPr>
-          <m:t>01</m:t>
-        </m:r>
-        <m:r>
-          <w:rPr>
-            <w:rFonts w:ascii="Cambria Math" w:hAnsi="Cambria Math" w:cs="Times New Roman"/>
-            <w:sz w:val="28"/>
-            <w:szCs w:val="28"/>
-            <w:lang w:val="en-US"/>
-          </w:rPr>
-          <m:t>0</m:t>
+          <m:t>=0,00010100</m:t>
         </m:r>
         <m:d>
           <m:dPr>
@@ -4972,16 +4413,7 @@
                 <w:szCs w:val="28"/>
                 <w:lang w:val="en-US"/>
               </w:rPr>
-              <m:t>01</m:t>
-            </m:r>
-            <m:r>
-              <w:rPr>
-                <w:rFonts w:ascii="Cambria Math" w:hAnsi="Cambria Math" w:cs="Times New Roman"/>
-                <w:sz w:val="28"/>
-                <w:szCs w:val="28"/>
-                <w:lang w:val="en-US"/>
-              </w:rPr>
-              <m:t>0</m:t>
+              <m:t>101</m:t>
             </m:r>
           </m:e>
         </m:d>
@@ -5028,8 +4460,32 @@
             <w:szCs w:val="28"/>
             <w:lang w:val="en-US"/>
           </w:rPr>
-          <m:t>=</m:t>
+          <m:t>=0,</m:t>
         </m:r>
+        <m:bar>
+          <m:barPr>
+            <m:ctrlPr>
+              <w:rPr>
+                <w:rFonts w:ascii="Cambria Math" w:hAnsi="Cambria Math" w:cs="Times New Roman"/>
+                <w:i/>
+                <w:sz w:val="28"/>
+                <w:szCs w:val="28"/>
+                <w:lang w:val="en-US"/>
+              </w:rPr>
+            </m:ctrlPr>
+          </m:barPr>
+          <m:e>
+            <m:r>
+              <w:rPr>
+                <w:rFonts w:ascii="Cambria Math" w:hAnsi="Cambria Math" w:cs="Times New Roman"/>
+                <w:sz w:val="28"/>
+                <w:szCs w:val="28"/>
+                <w:lang w:val="en-US"/>
+              </w:rPr>
+              <m:t>0</m:t>
+            </m:r>
+          </m:e>
+        </m:bar>
         <m:r>
           <w:rPr>
             <w:rFonts w:ascii="Cambria Math" w:hAnsi="Cambria Math" w:cs="Times New Roman"/>
@@ -5037,8 +4493,61 @@
             <w:szCs w:val="28"/>
             <w:lang w:val="en-US"/>
           </w:rPr>
-          <m:t>0</m:t>
+          <m:t>1010000</m:t>
         </m:r>
+      </m:oMath>
+      <w:r>
+        <w:rPr>
+          <w:rFonts w:ascii="Times New Roman" w:hAnsi="Times New Roman" w:cs="Times New Roman"/>
+          <w:sz w:val="28"/>
+          <w:szCs w:val="28"/>
+          <w:lang w:val="en-US"/>
+        </w:rPr>
+        <w:br/>
+      </w:r>
+    </w:p>
+    <w:p>
+      <w:pPr>
+        <w:pStyle w:val="a7"/>
+        <w:numPr>
+          <w:ilvl w:val="0"/>
+          <w:numId w:val="4"/>
+        </w:numPr>
+        <w:ind w:left="426" w:hanging="426"/>
+        <w:jc w:val="both"/>
+        <w:rPr>
+          <w:rFonts w:ascii="Times New Roman" w:hAnsi="Times New Roman" w:cs="Times New Roman"/>
+          <w:sz w:val="28"/>
+          <w:szCs w:val="28"/>
+          <w:lang w:val="en-US"/>
+        </w:rPr>
+      </w:pPr>
+      <m:oMath>
+        <m:acc>
+          <m:accPr>
+            <m:chr m:val="⃗"/>
+            <m:ctrlPr>
+              <w:rPr>
+                <w:rFonts w:ascii="Cambria Math" w:hAnsi="Cambria Math" w:cs="Times New Roman"/>
+                <w:i/>
+                <w:sz w:val="28"/>
+                <w:szCs w:val="28"/>
+                <w:lang w:val="en-US"/>
+              </w:rPr>
+            </m:ctrlPr>
+          </m:accPr>
+          <m:e>
+            <m:r>
+              <w:rPr>
+                <w:rFonts w:ascii="Cambria Math" w:hAnsi="Cambria Math" w:cs="Times New Roman"/>
+                <w:sz w:val="28"/>
+                <w:szCs w:val="28"/>
+                <w:lang w:val="en-US"/>
+              </w:rPr>
+              <m:t>R2</m:t>
+            </m:r>
+          </m:e>
+        </m:acc>
         <m:r>
           <w:rPr>
             <w:rFonts w:ascii="Cambria Math" w:hAnsi="Cambria Math" w:cs="Times New Roman"/>
@@ -5046,7 +4555,78 @@
             <w:szCs w:val="28"/>
             <w:lang w:val="en-US"/>
           </w:rPr>
-          <m:t>,</m:t>
+          <m:t>=0,00001010</m:t>
+        </m:r>
+        <m:d>
+          <m:dPr>
+            <m:begChr m:val="|"/>
+            <m:endChr m:val=""/>
+            <m:ctrlPr>
+              <w:rPr>
+                <w:rFonts w:ascii="Cambria Math" w:hAnsi="Cambria Math" w:cs="Times New Roman"/>
+                <w:i/>
+                <w:sz w:val="28"/>
+                <w:szCs w:val="28"/>
+                <w:lang w:val="en-US"/>
+              </w:rPr>
+            </m:ctrlPr>
+          </m:dPr>
+          <m:e>
+            <m:r>
+              <w:rPr>
+                <w:rFonts w:ascii="Cambria Math" w:hAnsi="Cambria Math" w:cs="Times New Roman"/>
+                <w:sz w:val="28"/>
+                <w:szCs w:val="28"/>
+                <w:lang w:val="en-US"/>
+              </w:rPr>
+              <m:t>010</m:t>
+            </m:r>
+          </m:e>
+        </m:d>
+      </m:oMath>
+      <w:r>
+        <w:rPr>
+          <w:rFonts w:ascii="Times New Roman" w:hAnsi="Times New Roman" w:cs="Times New Roman"/>
+          <w:sz w:val="28"/>
+          <w:szCs w:val="28"/>
+          <w:lang w:val="en-US"/>
+        </w:rPr>
+        <w:t xml:space="preserve"> </w:t>
+      </w:r>
+      <m:oMath>
+        <m:acc>
+          <m:accPr>
+            <m:chr m:val="⃖"/>
+            <m:ctrlPr>
+              <w:rPr>
+                <w:rFonts w:ascii="Cambria Math" w:hAnsi="Cambria Math" w:cs="Times New Roman"/>
+                <w:i/>
+                <w:sz w:val="28"/>
+                <w:szCs w:val="28"/>
+                <w:lang w:val="en-US"/>
+              </w:rPr>
+            </m:ctrlPr>
+          </m:accPr>
+          <m:e>
+            <m:r>
+              <w:rPr>
+                <w:rFonts w:ascii="Cambria Math" w:hAnsi="Cambria Math" w:cs="Times New Roman"/>
+                <w:sz w:val="28"/>
+                <w:szCs w:val="28"/>
+                <w:lang w:val="en-US"/>
+              </w:rPr>
+              <m:t>R1</m:t>
+            </m:r>
+          </m:e>
+        </m:acc>
+        <m:r>
+          <w:rPr>
+            <w:rFonts w:ascii="Cambria Math" w:hAnsi="Cambria Math" w:cs="Times New Roman"/>
+            <w:sz w:val="28"/>
+            <w:szCs w:val="28"/>
+            <w:lang w:val="en-US"/>
+          </w:rPr>
+          <m:t>=0,</m:t>
         </m:r>
         <m:bar>
           <m:barPr>
@@ -5103,34 +4683,7 @@
               <w:szCs w:val="28"/>
               <w:lang w:val="en-US"/>
             </w:rPr>
-            <m:t>Σ</m:t>
-          </m:r>
-          <m:r>
-            <w:rPr>
-              <w:rFonts w:ascii="Cambria Math" w:hAnsi="Cambria Math" w:cs="Times New Roman"/>
-              <w:sz w:val="28"/>
-              <w:szCs w:val="28"/>
-              <w:lang w:val="en-US"/>
-            </w:rPr>
-            <m:t>=</m:t>
-          </m:r>
-          <m:r>
-            <w:rPr>
-              <w:rFonts w:ascii="Cambria Math" w:hAnsi="Cambria Math" w:cs="Times New Roman"/>
-              <w:sz w:val="28"/>
-              <w:szCs w:val="28"/>
-              <w:lang w:val="en-US"/>
-            </w:rPr>
-            <m:t>Σ</m:t>
-          </m:r>
-          <m:r>
-            <w:rPr>
-              <w:rFonts w:ascii="Cambria Math" w:hAnsi="Cambria Math" w:cs="Times New Roman"/>
-              <w:sz w:val="28"/>
-              <w:szCs w:val="28"/>
-              <w:lang w:val="en-US"/>
-            </w:rPr>
-            <m:t>+R2=0,00001010</m:t>
+            <m:t>Σ=Σ+R2=0,00001010</m:t>
           </m:r>
           <m:d>
             <m:dPr>
@@ -5210,16 +4763,7 @@
             <w:szCs w:val="28"/>
             <w:lang w:val="en-US"/>
           </w:rPr>
-          <m:t>=0,000001</m:t>
-        </m:r>
-        <m:r>
-          <w:rPr>
-            <w:rFonts w:ascii="Cambria Math" w:hAnsi="Cambria Math" w:cs="Times New Roman"/>
-            <w:sz w:val="28"/>
-            <w:szCs w:val="28"/>
-            <w:lang w:val="en-US"/>
-          </w:rPr>
-          <m:t>01</m:t>
+          <m:t>=0,00000101</m:t>
         </m:r>
         <m:d>
           <m:dPr>
@@ -5290,25 +4834,7 @@
             <w:szCs w:val="28"/>
             <w:lang w:val="en-US"/>
           </w:rPr>
-          <m:t>=</m:t>
-        </m:r>
-        <m:r>
-          <w:rPr>
-            <w:rFonts w:ascii="Cambria Math" w:hAnsi="Cambria Math" w:cs="Times New Roman"/>
-            <w:sz w:val="28"/>
-            <w:szCs w:val="28"/>
-            <w:lang w:val="en-US"/>
-          </w:rPr>
-          <m:t>1</m:t>
-        </m:r>
-        <m:r>
-          <w:rPr>
-            <w:rFonts w:ascii="Cambria Math" w:hAnsi="Cambria Math" w:cs="Times New Roman"/>
-            <w:sz w:val="28"/>
-            <w:szCs w:val="28"/>
-            <w:lang w:val="en-US"/>
-          </w:rPr>
-          <m:t>,</m:t>
+          <m:t>=1,</m:t>
         </m:r>
         <m:bar>
           <m:barPr>
@@ -5403,16 +4929,7 @@
             <w:szCs w:val="28"/>
             <w:lang w:val="en-US"/>
           </w:rPr>
-          <m:t>=0,0000001</m:t>
-        </m:r>
-        <m:r>
-          <w:rPr>
-            <w:rFonts w:ascii="Cambria Math" w:hAnsi="Cambria Math" w:cs="Times New Roman"/>
-            <w:sz w:val="28"/>
-            <w:szCs w:val="28"/>
-            <w:lang w:val="en-US"/>
-          </w:rPr>
-          <m:t>0</m:t>
+          <m:t>=0,00000010</m:t>
         </m:r>
         <m:d>
           <m:dPr>
@@ -5540,34 +5057,7 @@
               <w:szCs w:val="28"/>
               <w:lang w:val="en-US"/>
             </w:rPr>
-            <m:t>Σ</m:t>
-          </m:r>
-          <m:r>
-            <w:rPr>
-              <w:rFonts w:ascii="Cambria Math" w:hAnsi="Cambria Math" w:cs="Times New Roman"/>
-              <w:sz w:val="28"/>
-              <w:szCs w:val="28"/>
-              <w:lang w:val="en-US"/>
-            </w:rPr>
-            <m:t>=</m:t>
-          </m:r>
-          <m:r>
-            <w:rPr>
-              <w:rFonts w:ascii="Cambria Math" w:hAnsi="Cambria Math" w:cs="Times New Roman"/>
-              <w:sz w:val="28"/>
-              <w:szCs w:val="28"/>
-              <w:lang w:val="en-US"/>
-            </w:rPr>
-            <m:t>Σ</m:t>
-          </m:r>
-          <m:r>
-            <w:rPr>
-              <w:rFonts w:ascii="Cambria Math" w:hAnsi="Cambria Math" w:cs="Times New Roman"/>
-              <w:sz w:val="28"/>
-              <w:szCs w:val="28"/>
-              <w:lang w:val="en-US"/>
-            </w:rPr>
-            <m:t>+R2=0,00001010</m:t>
+            <m:t>Σ=Σ+R2=0,00001010</m:t>
           </m:r>
           <m:d>
             <m:dPr>
@@ -5602,16 +5092,7 @@
               <w:szCs w:val="28"/>
               <w:lang w:val="en-US"/>
             </w:rPr>
-            <m:t>+</m:t>
-          </m:r>
-          <m:r>
-            <w:rPr>
-              <w:rFonts w:ascii="Cambria Math" w:hAnsi="Cambria Math" w:cs="Times New Roman"/>
-              <w:sz w:val="28"/>
-              <w:szCs w:val="28"/>
-              <w:lang w:val="en-US"/>
-            </w:rPr>
-            <m:t>0,00000010</m:t>
+            <m:t>+0,00000010</m:t>
           </m:r>
           <m:d>
             <m:dPr>
@@ -5916,25 +5397,7 @@
                 <w:szCs w:val="28"/>
                 <w:lang w:val="en-US"/>
               </w:rPr>
-              <m:t>1</m:t>
-            </m:r>
-            <m:r>
-              <w:rPr>
-                <w:rFonts w:ascii="Cambria Math" w:hAnsi="Cambria Math" w:cs="Times New Roman"/>
-                <w:sz w:val="28"/>
-                <w:szCs w:val="28"/>
-                <w:lang w:val="en-US"/>
-              </w:rPr>
-              <m:t>0</m:t>
-            </m:r>
-            <m:r>
-              <w:rPr>
-                <w:rFonts w:ascii="Cambria Math" w:hAnsi="Cambria Math" w:cs="Times New Roman"/>
-                <w:sz w:val="28"/>
-                <w:szCs w:val="28"/>
-                <w:lang w:val="en-US"/>
-              </w:rPr>
-              <m:t>1</m:t>
+              <m:t>101</m:t>
             </m:r>
           </m:e>
         </m:d>
@@ -6051,61 +5514,7 @@
             <w:szCs w:val="28"/>
             <w:lang w:val="en-US"/>
           </w:rPr>
-          <m:t>Σ</m:t>
-        </m:r>
-        <m:r>
-          <w:rPr>
-            <w:rFonts w:ascii="Cambria Math" w:hAnsi="Cambria Math" w:cs="Times New Roman"/>
-            <w:sz w:val="28"/>
-            <w:szCs w:val="28"/>
-            <w:lang w:val="en-US"/>
-          </w:rPr>
-          <m:t>=</m:t>
-        </m:r>
-        <m:r>
-          <w:rPr>
-            <w:rFonts w:ascii="Cambria Math" w:hAnsi="Cambria Math" w:cs="Times New Roman"/>
-            <w:sz w:val="28"/>
-            <w:szCs w:val="28"/>
-            <w:lang w:val="en-US"/>
-          </w:rPr>
-          <m:t>Σ</m:t>
-        </m:r>
-        <m:r>
-          <w:rPr>
-            <w:rFonts w:ascii="Cambria Math" w:hAnsi="Cambria Math" w:cs="Times New Roman"/>
-            <w:sz w:val="28"/>
-            <w:szCs w:val="28"/>
-            <w:lang w:val="en-US"/>
-          </w:rPr>
-          <m:t>+</m:t>
-        </m:r>
-        <m:r>
-          <w:rPr>
-            <w:rFonts w:ascii="Cambria Math" w:hAnsi="Cambria Math" w:cs="Times New Roman"/>
-            <w:sz w:val="28"/>
-            <w:szCs w:val="28"/>
-            <w:lang w:val="en-US"/>
-          </w:rPr>
-          <m:t>0,0000</m:t>
-        </m:r>
-        <m:r>
-          <w:rPr>
-            <w:rFonts w:ascii="Cambria Math" w:hAnsi="Cambria Math" w:cs="Times New Roman"/>
-            <w:sz w:val="28"/>
-            <w:szCs w:val="28"/>
-            <w:lang w:val="en-US"/>
-          </w:rPr>
-          <m:t>00</m:t>
-        </m:r>
-        <m:r>
-          <w:rPr>
-            <w:rFonts w:ascii="Cambria Math" w:hAnsi="Cambria Math" w:cs="Times New Roman"/>
-            <w:sz w:val="28"/>
-            <w:szCs w:val="28"/>
-            <w:lang w:val="en-US"/>
-          </w:rPr>
-          <m:t>00</m:t>
+          <m:t>Σ=Σ+0,00000000</m:t>
         </m:r>
         <m:d>
           <m:dPr>
@@ -6140,16 +5549,7 @@
             <w:szCs w:val="28"/>
             <w:lang w:val="en-US"/>
           </w:rPr>
-          <m:t>=</m:t>
-        </m:r>
-        <m:r>
-          <w:rPr>
-            <w:rFonts w:ascii="Cambria Math" w:hAnsi="Cambria Math" w:cs="Times New Roman"/>
-            <w:sz w:val="28"/>
-            <w:szCs w:val="28"/>
-            <w:lang w:val="en-US"/>
-          </w:rPr>
-          <m:t>0,00001100</m:t>
+          <m:t>=0,00001100</m:t>
         </m:r>
         <m:d>
           <m:dPr>
@@ -6184,25 +5584,7 @@
             <w:szCs w:val="28"/>
             <w:lang w:val="en-US"/>
           </w:rPr>
-          <m:t>+0,000000</m:t>
-        </m:r>
-        <m:r>
-          <w:rPr>
-            <w:rFonts w:ascii="Cambria Math" w:hAnsi="Cambria Math" w:cs="Times New Roman"/>
-            <w:sz w:val="28"/>
-            <w:szCs w:val="28"/>
-            <w:lang w:val="en-US"/>
-          </w:rPr>
-          <m:t>0</m:t>
-        </m:r>
-        <m:r>
-          <w:rPr>
-            <w:rFonts w:ascii="Cambria Math" w:hAnsi="Cambria Math" w:cs="Times New Roman"/>
-            <w:sz w:val="28"/>
-            <w:szCs w:val="28"/>
-            <w:lang w:val="en-US"/>
-          </w:rPr>
-          <m:t>0</m:t>
+          <m:t>+0,00000000</m:t>
         </m:r>
         <m:d>
           <m:dPr>
@@ -6226,16 +5608,7 @@
                 <w:szCs w:val="28"/>
                 <w:lang w:val="en-US"/>
               </w:rPr>
-              <m:t>01</m:t>
-            </m:r>
-            <m:r>
-              <w:rPr>
-                <w:rFonts w:ascii="Cambria Math" w:hAnsi="Cambria Math" w:cs="Times New Roman"/>
-                <w:sz w:val="28"/>
-                <w:szCs w:val="28"/>
-                <w:lang w:val="en-US"/>
-              </w:rPr>
-              <m:t>0</m:t>
+              <m:t>010</m:t>
             </m:r>
           </m:e>
         </m:d>
@@ -6246,16 +5619,7 @@
             <w:szCs w:val="28"/>
             <w:lang w:val="en-US"/>
           </w:rPr>
-          <m:t>=0,0000110</m:t>
-        </m:r>
-        <m:r>
-          <w:rPr>
-            <w:rFonts w:ascii="Cambria Math" w:hAnsi="Cambria Math" w:cs="Times New Roman"/>
-            <w:sz w:val="28"/>
-            <w:szCs w:val="28"/>
-            <w:lang w:val="en-US"/>
-          </w:rPr>
-          <m:t>1</m:t>
+          <m:t>=0,00001101</m:t>
         </m:r>
         <m:d>
           <m:dPr>
@@ -6368,16 +5732,7 @@
             <w:szCs w:val="28"/>
             <w:lang w:val="en-US"/>
           </w:rPr>
-          <m:t>=</m:t>
-        </m:r>
-        <m:r>
-          <w:rPr>
-            <w:rFonts w:ascii="Cambria Math" w:hAnsi="Cambria Math" w:cs="Times New Roman"/>
-            <w:sz w:val="28"/>
-            <w:szCs w:val="28"/>
-            <w:lang w:val="en-US"/>
-          </w:rPr>
-          <m:t>0,11010000</m:t>
+          <m:t>=0,11010000</m:t>
         </m:r>
       </m:oMath>
       <w:r>
@@ -6877,29 +6232,7 @@
           <w:sz w:val="28"/>
           <w:szCs w:val="28"/>
         </w:rPr>
-        <w:t xml:space="preserve">. </w:t>
-      </w:r>
-      <w:r>
-        <w:rPr>
-          <w:rFonts w:ascii="Times New Roman" w:hAnsi="Times New Roman" w:cs="Times New Roman"/>
-          <w:i w:val="0"/>
-          <w:iCs w:val="0"/>
-          <w:color w:val="auto"/>
-          <w:sz w:val="28"/>
-          <w:szCs w:val="28"/>
-        </w:rPr>
-        <w:t>Загрузка данных с дальнейшей обработкой порядков</w:t>
-      </w:r>
-      <w:r>
-        <w:rPr>
-          <w:rFonts w:ascii="Times New Roman" w:hAnsi="Times New Roman" w:cs="Times New Roman"/>
-          <w:i w:val="0"/>
-          <w:iCs w:val="0"/>
-          <w:color w:val="auto"/>
-          <w:sz w:val="28"/>
-          <w:szCs w:val="28"/>
-        </w:rPr>
-        <w:t>.</w:t>
+        <w:t>. Загрузка данных с дальнейшей обработкой порядков.</w:t>
       </w:r>
     </w:p>
     <w:p>
@@ -7307,25 +6640,7 @@
                     <w:szCs w:val="28"/>
                     <w:lang w:val="en-US"/>
                   </w:rPr>
-                  <m:t>RP1[</m:t>
-                </m:r>
-                <m:r>
-                  <w:rPr>
-                    <w:rFonts w:ascii="Cambria Math" w:hAnsi="Cambria Math" w:cs="Times New Roman"/>
-                    <w:sz w:val="28"/>
-                    <w:szCs w:val="28"/>
-                    <w:lang w:val="en-US"/>
-                  </w:rPr>
-                  <m:t>1</m:t>
-                </m:r>
-                <m:r>
-                  <w:rPr>
-                    <w:rFonts w:ascii="Cambria Math" w:hAnsi="Cambria Math" w:cs="Times New Roman"/>
-                    <w:sz w:val="28"/>
-                    <w:szCs w:val="28"/>
-                    <w:lang w:val="en-US"/>
-                  </w:rPr>
-                  <m:t>]</m:t>
+                  <m:t>RP1[1]</m:t>
                 </m:r>
               </m:oMath>
             </m:oMathPara>
@@ -8007,16 +7322,7 @@
                     <w:szCs w:val="28"/>
                     <w:lang w:val="en-US"/>
                   </w:rPr>
-                  <m:t>y</m:t>
-                </m:r>
-                <m:r>
-                  <w:rPr>
-                    <w:rFonts w:ascii="Cambria Math" w:hAnsi="Cambria Math" w:cs="Times New Roman"/>
-                    <w:sz w:val="28"/>
-                    <w:szCs w:val="28"/>
-                    <w:lang w:val="en-US"/>
-                  </w:rPr>
-                  <m:t>2</m:t>
+                  <m:t>y2</m:t>
                 </m:r>
               </m:oMath>
             </m:oMathPara>
@@ -8106,16 +7412,7 @@
                     <w:szCs w:val="28"/>
                     <w:lang w:val="en-US"/>
                   </w:rPr>
-                  <m:t>y</m:t>
-                </m:r>
-                <m:r>
-                  <w:rPr>
-                    <w:rFonts w:ascii="Cambria Math" w:hAnsi="Cambria Math" w:cs="Times New Roman"/>
-                    <w:sz w:val="28"/>
-                    <w:szCs w:val="28"/>
-                    <w:lang w:val="en-US"/>
-                  </w:rPr>
-                  <m:t>3</m:t>
+                  <m:t>y3</m:t>
                 </m:r>
               </m:oMath>
             </m:oMathPara>
@@ -8234,16 +7531,7 @@
                     <w:szCs w:val="28"/>
                     <w:lang w:val="en-US"/>
                   </w:rPr>
-                  <m:t>y</m:t>
-                </m:r>
-                <m:r>
-                  <w:rPr>
-                    <w:rFonts w:ascii="Cambria Math" w:hAnsi="Cambria Math" w:cs="Times New Roman"/>
-                    <w:sz w:val="28"/>
-                    <w:szCs w:val="28"/>
-                    <w:lang w:val="en-US"/>
-                  </w:rPr>
-                  <m:t>4</m:t>
+                  <m:t>y4</m:t>
                 </m:r>
               </m:oMath>
             </m:oMathPara>
@@ -8280,17 +7568,7 @@
                     <w:rFonts w:ascii="Cambria Math" w:eastAsia="Cambria Math" w:hAnsi="Cambria Math" w:cs="Cambria Math"/>
                     <w:sz w:val="28"/>
                   </w:rPr>
-                  <m:t>⊕</m:t>
-                </m:r>
-                <m:r>
-                  <m:rPr>
-                    <m:sty m:val="p"/>
-                  </m:rPr>
-                  <w:rPr>
-                    <w:rFonts w:ascii="Cambria Math" w:eastAsia="Cambria Math" w:hAnsi="Cambria Math" w:cs="Cambria Math"/>
-                    <w:sz w:val="28"/>
-                  </w:rPr>
-                  <m:t>R2[1]</m:t>
+                  <m:t>⊕R2[1]</m:t>
                 </m:r>
               </m:oMath>
             </m:oMathPara>
@@ -8342,16 +7620,7 @@
                     <w:szCs w:val="28"/>
                     <w:lang w:val="en-US"/>
                   </w:rPr>
-                  <m:t>y</m:t>
-                </m:r>
-                <m:r>
-                  <w:rPr>
-                    <w:rFonts w:ascii="Cambria Math" w:hAnsi="Cambria Math" w:cs="Times New Roman"/>
-                    <w:sz w:val="28"/>
-                    <w:szCs w:val="28"/>
-                    <w:lang w:val="en-US"/>
-                  </w:rPr>
-                  <m:t>5</m:t>
+                  <m:t>y5</m:t>
                 </m:r>
               </m:oMath>
             </m:oMathPara>
@@ -8522,16 +7791,7 @@
                     <w:szCs w:val="28"/>
                     <w:lang w:val="en-US"/>
                   </w:rPr>
-                  <m:t>y</m:t>
-                </m:r>
-                <m:r>
-                  <w:rPr>
-                    <w:rFonts w:ascii="Cambria Math" w:hAnsi="Cambria Math" w:cs="Times New Roman"/>
-                    <w:sz w:val="28"/>
-                    <w:szCs w:val="28"/>
-                    <w:lang w:val="en-US"/>
-                  </w:rPr>
-                  <m:t>6</m:t>
+                  <m:t>y6</m:t>
                 </m:r>
               </m:oMath>
             </m:oMathPara>
@@ -8638,16 +7898,7 @@
                     <w:szCs w:val="28"/>
                     <w:lang w:val="en-US"/>
                   </w:rPr>
-                  <m:t>y</m:t>
-                </m:r>
-                <m:r>
-                  <w:rPr>
-                    <w:rFonts w:ascii="Cambria Math" w:hAnsi="Cambria Math" w:cs="Times New Roman"/>
-                    <w:sz w:val="28"/>
-                    <w:szCs w:val="28"/>
-                    <w:lang w:val="en-US"/>
-                  </w:rPr>
-                  <m:t>7</m:t>
+                  <m:t>y7</m:t>
                 </m:r>
               </m:oMath>
             </m:oMathPara>
@@ -8772,16 +8023,7 @@
                     <w:szCs w:val="28"/>
                     <w:lang w:val="en-US"/>
                   </w:rPr>
-                  <m:t>y</m:t>
-                </m:r>
-                <m:r>
-                  <w:rPr>
-                    <w:rFonts w:ascii="Cambria Math" w:hAnsi="Cambria Math" w:cs="Times New Roman"/>
-                    <w:sz w:val="28"/>
-                    <w:szCs w:val="28"/>
-                    <w:lang w:val="en-US"/>
-                  </w:rPr>
-                  <m:t>8</m:t>
+                  <m:t>y8</m:t>
                 </m:r>
               </m:oMath>
             </m:oMathPara>
@@ -8933,16 +8175,7 @@
                     <w:szCs w:val="28"/>
                     <w:lang w:val="en-US"/>
                   </w:rPr>
-                  <m:t>y</m:t>
-                </m:r>
-                <m:r>
-                  <w:rPr>
-                    <w:rFonts w:ascii="Cambria Math" w:hAnsi="Cambria Math" w:cs="Times New Roman"/>
-                    <w:sz w:val="28"/>
-                    <w:szCs w:val="28"/>
-                    <w:lang w:val="en-US"/>
-                  </w:rPr>
-                  <m:t>9</m:t>
+                  <m:t>y9</m:t>
                 </m:r>
               </m:oMath>
             </m:oMathPara>
@@ -9068,16 +8301,7 @@
                     <w:szCs w:val="28"/>
                     <w:lang w:val="en-US"/>
                   </w:rPr>
-                  <m:t>y1</m:t>
-                </m:r>
-                <m:r>
-                  <w:rPr>
-                    <w:rFonts w:ascii="Cambria Math" w:hAnsi="Cambria Math" w:cs="Times New Roman"/>
-                    <w:sz w:val="28"/>
-                    <w:szCs w:val="28"/>
-                    <w:lang w:val="en-US"/>
-                  </w:rPr>
-                  <m:t>0</m:t>
+                  <m:t>y10</m:t>
                 </m:r>
               </m:oMath>
             </m:oMathPara>
@@ -9993,16 +9217,7 @@
                     <w:szCs w:val="28"/>
                     <w:lang w:val="en-US"/>
                   </w:rPr>
-                  <m:t>y1</m:t>
-                </m:r>
-                <m:r>
-                  <w:rPr>
-                    <w:rFonts w:ascii="Cambria Math" w:hAnsi="Cambria Math" w:cs="Times New Roman"/>
-                    <w:sz w:val="28"/>
-                    <w:szCs w:val="28"/>
-                    <w:lang w:val="en-US"/>
-                  </w:rPr>
-                  <m:t>6</m:t>
+                  <m:t>y16</m:t>
                 </m:r>
               </m:oMath>
             </m:oMathPara>
@@ -10505,16 +9720,7 @@
                     <w:szCs w:val="28"/>
                     <w:lang w:val="en-US"/>
                   </w:rPr>
-                  <m:t>y</m:t>
-                </m:r>
-                <m:r>
-                  <w:rPr>
-                    <w:rFonts w:ascii="Cambria Math" w:hAnsi="Cambria Math" w:cs="Times New Roman"/>
-                    <w:sz w:val="28"/>
-                    <w:szCs w:val="28"/>
-                    <w:lang w:val="en-US"/>
-                  </w:rPr>
-                  <m:t>20</m:t>
+                  <m:t>y20</m:t>
                 </m:r>
               </m:oMath>
             </m:oMathPara>
@@ -10632,16 +9838,7 @@
                     <w:szCs w:val="28"/>
                     <w:lang w:val="en-US"/>
                   </w:rPr>
-                  <m:t>y2</m:t>
-                </m:r>
-                <m:r>
-                  <w:rPr>
-                    <w:rFonts w:ascii="Cambria Math" w:hAnsi="Cambria Math" w:cs="Times New Roman"/>
-                    <w:sz w:val="28"/>
-                    <w:szCs w:val="28"/>
-                    <w:lang w:val="en-US"/>
-                  </w:rPr>
-                  <m:t>1</m:t>
+                  <m:t>y21</m:t>
                 </m:r>
               </m:oMath>
             </m:oMathPara>
@@ -10748,16 +9945,7 @@
                     <w:szCs w:val="28"/>
                     <w:lang w:val="en-US"/>
                   </w:rPr>
-                  <m:t>y2</m:t>
-                </m:r>
-                <m:r>
-                  <w:rPr>
-                    <w:rFonts w:ascii="Cambria Math" w:hAnsi="Cambria Math" w:cs="Times New Roman"/>
-                    <w:sz w:val="28"/>
-                    <w:szCs w:val="28"/>
-                    <w:lang w:val="en-US"/>
-                  </w:rPr>
-                  <m:t>2</m:t>
+                  <m:t>y22</m:t>
                 </m:r>
               </m:oMath>
             </m:oMathPara>
@@ -10868,16 +10056,7 @@
                     <w:szCs w:val="28"/>
                     <w:lang w:val="en-US"/>
                   </w:rPr>
-                  <m:t>y2</m:t>
-                </m:r>
-                <m:r>
-                  <w:rPr>
-                    <w:rFonts w:ascii="Cambria Math" w:hAnsi="Cambria Math" w:cs="Times New Roman"/>
-                    <w:sz w:val="28"/>
-                    <w:szCs w:val="28"/>
-                    <w:lang w:val="en-US"/>
-                  </w:rPr>
-                  <m:t>3</m:t>
+                  <m:t>y23</m:t>
                 </m:r>
               </m:oMath>
             </m:oMathPara>
@@ -11122,7 +10301,31 @@
           <w:highlight w:val="white"/>
           <w:lang w:val="en-US"/>
         </w:rPr>
-        <w:t>&lt;bitset&gt;</w:t>
+        <w:t>&lt;</w:t>
+      </w:r>
+      <w:proofErr w:type="spellStart"/>
+      <w:r>
+        <w:rPr>
+          <w:rFonts w:ascii="Cascadia Mono" w:hAnsi="Cascadia Mono" w:cs="Cascadia Mono"/>
+          <w:color w:val="A31515"/>
+          <w:sz w:val="28"/>
+          <w:szCs w:val="28"/>
+          <w:highlight w:val="white"/>
+          <w:lang w:val="en-US"/>
+        </w:rPr>
+        <w:t>bitset</w:t>
+      </w:r>
+      <w:proofErr w:type="spellEnd"/>
+      <w:r>
+        <w:rPr>
+          <w:rFonts w:ascii="Cascadia Mono" w:hAnsi="Cascadia Mono" w:cs="Cascadia Mono"/>
+          <w:color w:val="A31515"/>
+          <w:sz w:val="28"/>
+          <w:szCs w:val="28"/>
+          <w:highlight w:val="white"/>
+          <w:lang w:val="en-US"/>
+        </w:rPr>
+        <w:t>&gt;</w:t>
       </w:r>
     </w:p>
     <w:p>
@@ -11334,7 +10537,31 @@
           <w:highlight w:val="white"/>
           <w:lang w:val="en-US"/>
         </w:rPr>
-        <w:t xml:space="preserve"> main() {</w:t>
+        <w:t xml:space="preserve"> </w:t>
+      </w:r>
+      <w:proofErr w:type="gramStart"/>
+      <w:r>
+        <w:rPr>
+          <w:rFonts w:ascii="Cascadia Mono" w:hAnsi="Cascadia Mono" w:cs="Cascadia Mono"/>
+          <w:color w:val="000000"/>
+          <w:sz w:val="28"/>
+          <w:szCs w:val="28"/>
+          <w:highlight w:val="white"/>
+          <w:lang w:val="en-US"/>
+        </w:rPr>
+        <w:t>main(</w:t>
+      </w:r>
+      <w:proofErr w:type="gramEnd"/>
+      <w:r>
+        <w:rPr>
+          <w:rFonts w:ascii="Cascadia Mono" w:hAnsi="Cascadia Mono" w:cs="Cascadia Mono"/>
+          <w:color w:val="000000"/>
+          <w:sz w:val="28"/>
+          <w:szCs w:val="28"/>
+          <w:highlight w:val="white"/>
+          <w:lang w:val="en-US"/>
+        </w:rPr>
+        <w:t>) {</w:t>
       </w:r>
     </w:p>
     <w:p>
@@ -11361,8 +10588,34 @@
           <w:highlight w:val="white"/>
           <w:lang w:val="en-US"/>
         </w:rPr>
-        <w:t xml:space="preserve">    setlocale(</w:t>
-      </w:r>
+        <w:t xml:space="preserve">    </w:t>
+      </w:r>
+      <w:proofErr w:type="spellStart"/>
+      <w:proofErr w:type="gramStart"/>
+      <w:r>
+        <w:rPr>
+          <w:rFonts w:ascii="Cascadia Mono" w:hAnsi="Cascadia Mono" w:cs="Cascadia Mono"/>
+          <w:color w:val="000000"/>
+          <w:sz w:val="28"/>
+          <w:szCs w:val="28"/>
+          <w:highlight w:val="white"/>
+          <w:lang w:val="en-US"/>
+        </w:rPr>
+        <w:t>setlocale</w:t>
+      </w:r>
+      <w:proofErr w:type="spellEnd"/>
+      <w:r>
+        <w:rPr>
+          <w:rFonts w:ascii="Cascadia Mono" w:hAnsi="Cascadia Mono" w:cs="Cascadia Mono"/>
+          <w:color w:val="000000"/>
+          <w:sz w:val="28"/>
+          <w:szCs w:val="28"/>
+          <w:highlight w:val="white"/>
+          <w:lang w:val="en-US"/>
+        </w:rPr>
+        <w:t>(</w:t>
+      </w:r>
+      <w:proofErr w:type="gramEnd"/>
       <w:r>
         <w:rPr>
           <w:rFonts w:ascii="Cascadia Mono" w:hAnsi="Cascadia Mono" w:cs="Cascadia Mono"/>
@@ -11394,7 +10647,31 @@
           <w:highlight w:val="white"/>
           <w:lang w:val="en-US"/>
         </w:rPr>
-        <w:t>"ru_RU"</w:t>
+        <w:t>"</w:t>
+      </w:r>
+      <w:proofErr w:type="spellStart"/>
+      <w:r>
+        <w:rPr>
+          <w:rFonts w:ascii="Cascadia Mono" w:hAnsi="Cascadia Mono" w:cs="Cascadia Mono"/>
+          <w:color w:val="A31515"/>
+          <w:sz w:val="28"/>
+          <w:szCs w:val="28"/>
+          <w:highlight w:val="white"/>
+          <w:lang w:val="en-US"/>
+        </w:rPr>
+        <w:t>ru_RU</w:t>
+      </w:r>
+      <w:proofErr w:type="spellEnd"/>
+      <w:r>
+        <w:rPr>
+          <w:rFonts w:ascii="Cascadia Mono" w:hAnsi="Cascadia Mono" w:cs="Cascadia Mono"/>
+          <w:color w:val="A31515"/>
+          <w:sz w:val="28"/>
+          <w:szCs w:val="28"/>
+          <w:highlight w:val="white"/>
+          <w:lang w:val="en-US"/>
+        </w:rPr>
+        <w:t>"</w:t>
       </w:r>
       <w:r>
         <w:rPr>
@@ -11503,8 +10780,21 @@
           <w:highlight w:val="white"/>
           <w:lang w:val="en-US"/>
         </w:rPr>
-        <w:t>// сумматор</w:t>
-      </w:r>
+        <w:t xml:space="preserve">// </w:t>
+      </w:r>
+      <w:proofErr w:type="spellStart"/>
+      <w:r>
+        <w:rPr>
+          <w:rFonts w:ascii="Cascadia Mono" w:hAnsi="Cascadia Mono" w:cs="Cascadia Mono"/>
+          <w:color w:val="008000"/>
+          <w:sz w:val="28"/>
+          <w:szCs w:val="28"/>
+          <w:highlight w:val="white"/>
+          <w:lang w:val="en-US"/>
+        </w:rPr>
+        <w:t>сумматор</w:t>
+      </w:r>
+      <w:proofErr w:type="spellEnd"/>
     </w:p>
     <w:p>
       <w:pPr>
@@ -11568,7 +10858,31 @@
           <w:highlight w:val="white"/>
           <w:lang w:val="en-US"/>
         </w:rPr>
-        <w:t xml:space="preserve"> lastbit = </w:t>
+        <w:t xml:space="preserve"> </w:t>
+      </w:r>
+      <w:proofErr w:type="spellStart"/>
+      <w:r>
+        <w:rPr>
+          <w:rFonts w:ascii="Cascadia Mono" w:hAnsi="Cascadia Mono" w:cs="Cascadia Mono"/>
+          <w:color w:val="000000"/>
+          <w:sz w:val="28"/>
+          <w:szCs w:val="28"/>
+          <w:highlight w:val="white"/>
+          <w:lang w:val="en-US"/>
+        </w:rPr>
+        <w:t>lastbit</w:t>
+      </w:r>
+      <w:proofErr w:type="spellEnd"/>
+      <w:r>
+        <w:rPr>
+          <w:rFonts w:ascii="Cascadia Mono" w:hAnsi="Cascadia Mono" w:cs="Cascadia Mono"/>
+          <w:color w:val="000000"/>
+          <w:sz w:val="28"/>
+          <w:szCs w:val="28"/>
+          <w:highlight w:val="white"/>
+          <w:lang w:val="en-US"/>
+        </w:rPr>
+        <w:t xml:space="preserve"> = </w:t>
       </w:r>
       <w:r>
         <w:rPr>
@@ -11758,6 +11072,7 @@
         </w:rPr>
         <w:t xml:space="preserve">    </w:t>
       </w:r>
+      <w:proofErr w:type="spellStart"/>
       <w:r>
         <w:rPr>
           <w:rFonts w:ascii="Cascadia Mono" w:hAnsi="Cascadia Mono" w:cs="Cascadia Mono"/>
@@ -11769,6 +11084,7 @@
         </w:rPr>
         <w:t>cout</w:t>
       </w:r>
+      <w:proofErr w:type="spellEnd"/>
       <w:r>
         <w:rPr>
           <w:rFonts w:ascii="Cascadia Mono" w:hAnsi="Cascadia Mono" w:cs="Cascadia Mono"/>
@@ -11865,6 +11181,7 @@
         </w:rPr>
         <w:t xml:space="preserve"> </w:t>
       </w:r>
+      <w:proofErr w:type="spellStart"/>
       <w:r>
         <w:rPr>
           <w:rFonts w:ascii="Cascadia Mono" w:hAnsi="Cascadia Mono" w:cs="Cascadia Mono"/>
@@ -11876,6 +11193,7 @@
         </w:rPr>
         <w:t>zA</w:t>
       </w:r>
+      <w:proofErr w:type="spellEnd"/>
       <w:r>
         <w:rPr>
           <w:rFonts w:ascii="Cascadia Mono" w:hAnsi="Cascadia Mono" w:cs="Cascadia Mono"/>
@@ -11911,6 +11229,7 @@
         </w:rPr>
         <w:t xml:space="preserve">    </w:t>
       </w:r>
+      <w:proofErr w:type="spellStart"/>
       <w:r>
         <w:rPr>
           <w:rFonts w:ascii="Cascadia Mono" w:hAnsi="Cascadia Mono" w:cs="Cascadia Mono"/>
@@ -11922,6 +11241,7 @@
         </w:rPr>
         <w:t>cin</w:t>
       </w:r>
+      <w:proofErr w:type="spellEnd"/>
       <w:r>
         <w:rPr>
           <w:rFonts w:ascii="Cascadia Mono" w:hAnsi="Cascadia Mono" w:cs="Cascadia Mono"/>
@@ -11952,6 +11272,7 @@
         </w:rPr>
         <w:t xml:space="preserve"> </w:t>
       </w:r>
+      <w:proofErr w:type="spellStart"/>
       <w:r>
         <w:rPr>
           <w:rFonts w:ascii="Cascadia Mono" w:hAnsi="Cascadia Mono" w:cs="Cascadia Mono"/>
@@ -11963,6 +11284,7 @@
         </w:rPr>
         <w:t>zA</w:t>
       </w:r>
+      <w:proofErr w:type="spellEnd"/>
       <w:r>
         <w:rPr>
           <w:rFonts w:ascii="Cascadia Mono" w:hAnsi="Cascadia Mono" w:cs="Cascadia Mono"/>
@@ -12013,6 +11335,7 @@
         </w:rPr>
         <w:t xml:space="preserve">    </w:t>
       </w:r>
+      <w:proofErr w:type="spellStart"/>
       <w:r>
         <w:rPr>
           <w:rFonts w:ascii="Cascadia Mono" w:hAnsi="Cascadia Mono" w:cs="Cascadia Mono"/>
@@ -12024,6 +11347,7 @@
         </w:rPr>
         <w:t>cout</w:t>
       </w:r>
+      <w:proofErr w:type="spellEnd"/>
       <w:r>
         <w:rPr>
           <w:rFonts w:ascii="Cascadia Mono" w:hAnsi="Cascadia Mono" w:cs="Cascadia Mono"/>
@@ -12168,7 +11492,31 @@
           <w:highlight w:val="white"/>
           <w:lang w:val="en-US"/>
         </w:rPr>
-        <w:t xml:space="preserve">    cin </w:t>
+        <w:t xml:space="preserve">    </w:t>
+      </w:r>
+      <w:proofErr w:type="spellStart"/>
+      <w:r>
+        <w:rPr>
+          <w:rFonts w:ascii="Cascadia Mono" w:hAnsi="Cascadia Mono" w:cs="Cascadia Mono"/>
+          <w:color w:val="000000"/>
+          <w:sz w:val="28"/>
+          <w:szCs w:val="28"/>
+          <w:highlight w:val="white"/>
+          <w:lang w:val="en-US"/>
+        </w:rPr>
+        <w:t>cin</w:t>
+      </w:r>
+      <w:proofErr w:type="spellEnd"/>
+      <w:r>
+        <w:rPr>
+          <w:rFonts w:ascii="Cascadia Mono" w:hAnsi="Cascadia Mono" w:cs="Cascadia Mono"/>
+          <w:color w:val="000000"/>
+          <w:sz w:val="28"/>
+          <w:szCs w:val="28"/>
+          <w:highlight w:val="white"/>
+          <w:lang w:val="en-US"/>
+        </w:rPr>
+        <w:t xml:space="preserve"> </w:t>
       </w:r>
       <w:r>
         <w:rPr>
@@ -12219,6 +11567,7 @@
         </w:rPr>
         <w:t xml:space="preserve">    R2 = </w:t>
       </w:r>
+      <w:proofErr w:type="spellStart"/>
       <w:r>
         <w:rPr>
           <w:rFonts w:ascii="Cascadia Mono" w:hAnsi="Cascadia Mono" w:cs="Cascadia Mono"/>
@@ -12230,16 +11579,65 @@
         </w:rPr>
         <w:t>bitset</w:t>
       </w:r>
-      <w:r>
-        <w:rPr>
-          <w:rFonts w:ascii="Cascadia Mono" w:hAnsi="Cascadia Mono" w:cs="Cascadia Mono"/>
-          <w:color w:val="000000"/>
-          <w:sz w:val="28"/>
-          <w:szCs w:val="28"/>
-          <w:highlight w:val="white"/>
-          <w:lang w:val="en-US"/>
-        </w:rPr>
-        <w:t>&lt;8&gt;(mA).to_ulong();</w:t>
+      <w:proofErr w:type="spellEnd"/>
+      <w:r>
+        <w:rPr>
+          <w:rFonts w:ascii="Cascadia Mono" w:hAnsi="Cascadia Mono" w:cs="Cascadia Mono"/>
+          <w:color w:val="000000"/>
+          <w:sz w:val="28"/>
+          <w:szCs w:val="28"/>
+          <w:highlight w:val="white"/>
+          <w:lang w:val="en-US"/>
+        </w:rPr>
+        <w:t>&lt;8&gt;(mA).</w:t>
+      </w:r>
+      <w:proofErr w:type="spellStart"/>
+      <w:r>
+        <w:rPr>
+          <w:rFonts w:ascii="Cascadia Mono" w:hAnsi="Cascadia Mono" w:cs="Cascadia Mono"/>
+          <w:color w:val="000000"/>
+          <w:sz w:val="28"/>
+          <w:szCs w:val="28"/>
+          <w:highlight w:val="white"/>
+          <w:lang w:val="en-US"/>
+        </w:rPr>
+        <w:t>to_</w:t>
+      </w:r>
+      <w:proofErr w:type="gramStart"/>
+      <w:r>
+        <w:rPr>
+          <w:rFonts w:ascii="Cascadia Mono" w:hAnsi="Cascadia Mono" w:cs="Cascadia Mono"/>
+          <w:color w:val="000000"/>
+          <w:sz w:val="28"/>
+          <w:szCs w:val="28"/>
+          <w:highlight w:val="white"/>
+          <w:lang w:val="en-US"/>
+        </w:rPr>
+        <w:t>ulong</w:t>
+      </w:r>
+      <w:proofErr w:type="spellEnd"/>
+      <w:r>
+        <w:rPr>
+          <w:rFonts w:ascii="Cascadia Mono" w:hAnsi="Cascadia Mono" w:cs="Cascadia Mono"/>
+          <w:color w:val="000000"/>
+          <w:sz w:val="28"/>
+          <w:szCs w:val="28"/>
+          <w:highlight w:val="white"/>
+          <w:lang w:val="en-US"/>
+        </w:rPr>
+        <w:t>(</w:t>
+      </w:r>
+      <w:proofErr w:type="gramEnd"/>
+      <w:r>
+        <w:rPr>
+          <w:rFonts w:ascii="Cascadia Mono" w:hAnsi="Cascadia Mono" w:cs="Cascadia Mono"/>
+          <w:color w:val="000000"/>
+          <w:sz w:val="28"/>
+          <w:szCs w:val="28"/>
+          <w:highlight w:val="white"/>
+          <w:lang w:val="en-US"/>
+        </w:rPr>
+        <w:t>);</w:t>
       </w:r>
     </w:p>
     <w:p>
@@ -12326,7 +11724,31 @@
           <w:highlight w:val="white"/>
           <w:lang w:val="en-US"/>
         </w:rPr>
-        <w:t xml:space="preserve"> pA; </w:t>
+        <w:t xml:space="preserve"> </w:t>
+      </w:r>
+      <w:proofErr w:type="spellStart"/>
+      <w:r>
+        <w:rPr>
+          <w:rFonts w:ascii="Cascadia Mono" w:hAnsi="Cascadia Mono" w:cs="Cascadia Mono"/>
+          <w:color w:val="000000"/>
+          <w:sz w:val="28"/>
+          <w:szCs w:val="28"/>
+          <w:highlight w:val="white"/>
+          <w:lang w:val="en-US"/>
+        </w:rPr>
+        <w:t>pA</w:t>
+      </w:r>
+      <w:proofErr w:type="spellEnd"/>
+      <w:r>
+        <w:rPr>
+          <w:rFonts w:ascii="Cascadia Mono" w:hAnsi="Cascadia Mono" w:cs="Cascadia Mono"/>
+          <w:color w:val="000000"/>
+          <w:sz w:val="28"/>
+          <w:szCs w:val="28"/>
+          <w:highlight w:val="white"/>
+          <w:lang w:val="en-US"/>
+        </w:rPr>
+        <w:t xml:space="preserve">; </w:t>
       </w:r>
       <w:r>
         <w:rPr>
@@ -12337,7 +11759,31 @@
           <w:highlight w:val="white"/>
           <w:lang w:val="en-US"/>
         </w:rPr>
-        <w:t xml:space="preserve">// pA </w:t>
+        <w:t xml:space="preserve">// </w:t>
+      </w:r>
+      <w:proofErr w:type="spellStart"/>
+      <w:r>
+        <w:rPr>
+          <w:rFonts w:ascii="Cascadia Mono" w:hAnsi="Cascadia Mono" w:cs="Cascadia Mono"/>
+          <w:color w:val="008000"/>
+          <w:sz w:val="28"/>
+          <w:szCs w:val="28"/>
+          <w:highlight w:val="white"/>
+          <w:lang w:val="en-US"/>
+        </w:rPr>
+        <w:t>pA</w:t>
+      </w:r>
+      <w:proofErr w:type="spellEnd"/>
+      <w:r>
+        <w:rPr>
+          <w:rFonts w:ascii="Cascadia Mono" w:hAnsi="Cascadia Mono" w:cs="Cascadia Mono"/>
+          <w:color w:val="008000"/>
+          <w:sz w:val="28"/>
+          <w:szCs w:val="28"/>
+          <w:highlight w:val="white"/>
+          <w:lang w:val="en-US"/>
+        </w:rPr>
+        <w:t xml:space="preserve"> </w:t>
       </w:r>
     </w:p>
     <w:p>
@@ -12380,7 +11826,31 @@
           <w:highlight w:val="white"/>
           <w:lang w:val="en-US"/>
         </w:rPr>
-        <w:t xml:space="preserve">    cout </w:t>
+        <w:t xml:space="preserve">    </w:t>
+      </w:r>
+      <w:proofErr w:type="spellStart"/>
+      <w:r>
+        <w:rPr>
+          <w:rFonts w:ascii="Cascadia Mono" w:hAnsi="Cascadia Mono" w:cs="Cascadia Mono"/>
+          <w:color w:val="000000"/>
+          <w:sz w:val="28"/>
+          <w:szCs w:val="28"/>
+          <w:highlight w:val="white"/>
+          <w:lang w:val="en-US"/>
+        </w:rPr>
+        <w:t>cout</w:t>
+      </w:r>
+      <w:proofErr w:type="spellEnd"/>
+      <w:r>
+        <w:rPr>
+          <w:rFonts w:ascii="Cascadia Mono" w:hAnsi="Cascadia Mono" w:cs="Cascadia Mono"/>
+          <w:color w:val="000000"/>
+          <w:sz w:val="28"/>
+          <w:szCs w:val="28"/>
+          <w:highlight w:val="white"/>
+          <w:lang w:val="en-US"/>
+        </w:rPr>
+        <w:t xml:space="preserve"> </w:t>
       </w:r>
       <w:r>
         <w:rPr>
@@ -12413,7 +11883,103 @@
           <w:highlight w:val="white"/>
           <w:lang w:val="en-US"/>
         </w:rPr>
-        <w:t>"Введите порядок pA (5 разрядов): "</w:t>
+        <w:t>"</w:t>
+      </w:r>
+      <w:proofErr w:type="spellStart"/>
+      <w:r>
+        <w:rPr>
+          <w:rFonts w:ascii="Cascadia Mono" w:hAnsi="Cascadia Mono" w:cs="Cascadia Mono"/>
+          <w:color w:val="A31515"/>
+          <w:sz w:val="28"/>
+          <w:szCs w:val="28"/>
+          <w:highlight w:val="white"/>
+          <w:lang w:val="en-US"/>
+        </w:rPr>
+        <w:t>Введите</w:t>
+      </w:r>
+      <w:proofErr w:type="spellEnd"/>
+      <w:r>
+        <w:rPr>
+          <w:rFonts w:ascii="Cascadia Mono" w:hAnsi="Cascadia Mono" w:cs="Cascadia Mono"/>
+          <w:color w:val="A31515"/>
+          <w:sz w:val="28"/>
+          <w:szCs w:val="28"/>
+          <w:highlight w:val="white"/>
+          <w:lang w:val="en-US"/>
+        </w:rPr>
+        <w:t xml:space="preserve"> </w:t>
+      </w:r>
+      <w:proofErr w:type="spellStart"/>
+      <w:r>
+        <w:rPr>
+          <w:rFonts w:ascii="Cascadia Mono" w:hAnsi="Cascadia Mono" w:cs="Cascadia Mono"/>
+          <w:color w:val="A31515"/>
+          <w:sz w:val="28"/>
+          <w:szCs w:val="28"/>
+          <w:highlight w:val="white"/>
+          <w:lang w:val="en-US"/>
+        </w:rPr>
+        <w:t>порядок</w:t>
+      </w:r>
+      <w:proofErr w:type="spellEnd"/>
+      <w:r>
+        <w:rPr>
+          <w:rFonts w:ascii="Cascadia Mono" w:hAnsi="Cascadia Mono" w:cs="Cascadia Mono"/>
+          <w:color w:val="A31515"/>
+          <w:sz w:val="28"/>
+          <w:szCs w:val="28"/>
+          <w:highlight w:val="white"/>
+          <w:lang w:val="en-US"/>
+        </w:rPr>
+        <w:t xml:space="preserve"> </w:t>
+      </w:r>
+      <w:proofErr w:type="spellStart"/>
+      <w:r>
+        <w:rPr>
+          <w:rFonts w:ascii="Cascadia Mono" w:hAnsi="Cascadia Mono" w:cs="Cascadia Mono"/>
+          <w:color w:val="A31515"/>
+          <w:sz w:val="28"/>
+          <w:szCs w:val="28"/>
+          <w:highlight w:val="white"/>
+          <w:lang w:val="en-US"/>
+        </w:rPr>
+        <w:t>pA</w:t>
+      </w:r>
+      <w:proofErr w:type="spellEnd"/>
+      <w:r>
+        <w:rPr>
+          <w:rFonts w:ascii="Cascadia Mono" w:hAnsi="Cascadia Mono" w:cs="Cascadia Mono"/>
+          <w:color w:val="A31515"/>
+          <w:sz w:val="28"/>
+          <w:szCs w:val="28"/>
+          <w:highlight w:val="white"/>
+          <w:lang w:val="en-US"/>
+        </w:rPr>
+        <w:t xml:space="preserve"> (5 </w:t>
+      </w:r>
+      <w:proofErr w:type="spellStart"/>
+      <w:r>
+        <w:rPr>
+          <w:rFonts w:ascii="Cascadia Mono" w:hAnsi="Cascadia Mono" w:cs="Cascadia Mono"/>
+          <w:color w:val="A31515"/>
+          <w:sz w:val="28"/>
+          <w:szCs w:val="28"/>
+          <w:highlight w:val="white"/>
+          <w:lang w:val="en-US"/>
+        </w:rPr>
+        <w:t>разрядов</w:t>
+      </w:r>
+      <w:proofErr w:type="spellEnd"/>
+      <w:r>
+        <w:rPr>
+          <w:rFonts w:ascii="Cascadia Mono" w:hAnsi="Cascadia Mono" w:cs="Cascadia Mono"/>
+          <w:color w:val="A31515"/>
+          <w:sz w:val="28"/>
+          <w:szCs w:val="28"/>
+          <w:highlight w:val="white"/>
+          <w:lang w:val="en-US"/>
+        </w:rPr>
+        <w:t>): "</w:t>
       </w:r>
       <w:r>
         <w:rPr>
@@ -12473,7 +12039,31 @@
           <w:highlight w:val="white"/>
           <w:lang w:val="en-US"/>
         </w:rPr>
-        <w:t xml:space="preserve"> porA;</w:t>
+        <w:t xml:space="preserve"> </w:t>
+      </w:r>
+      <w:proofErr w:type="spellStart"/>
+      <w:r>
+        <w:rPr>
+          <w:rFonts w:ascii="Cascadia Mono" w:hAnsi="Cascadia Mono" w:cs="Cascadia Mono"/>
+          <w:color w:val="000000"/>
+          <w:sz w:val="28"/>
+          <w:szCs w:val="28"/>
+          <w:highlight w:val="white"/>
+          <w:lang w:val="en-US"/>
+        </w:rPr>
+        <w:t>porA</w:t>
+      </w:r>
+      <w:proofErr w:type="spellEnd"/>
+      <w:r>
+        <w:rPr>
+          <w:rFonts w:ascii="Cascadia Mono" w:hAnsi="Cascadia Mono" w:cs="Cascadia Mono"/>
+          <w:color w:val="000000"/>
+          <w:sz w:val="28"/>
+          <w:szCs w:val="28"/>
+          <w:highlight w:val="white"/>
+          <w:lang w:val="en-US"/>
+        </w:rPr>
+        <w:t>;</w:t>
       </w:r>
     </w:p>
     <w:p>
@@ -12500,7 +12090,31 @@
           <w:highlight w:val="white"/>
           <w:lang w:val="en-US"/>
         </w:rPr>
-        <w:t xml:space="preserve">    cin </w:t>
+        <w:t xml:space="preserve">    </w:t>
+      </w:r>
+      <w:proofErr w:type="spellStart"/>
+      <w:r>
+        <w:rPr>
+          <w:rFonts w:ascii="Cascadia Mono" w:hAnsi="Cascadia Mono" w:cs="Cascadia Mono"/>
+          <w:color w:val="000000"/>
+          <w:sz w:val="28"/>
+          <w:szCs w:val="28"/>
+          <w:highlight w:val="white"/>
+          <w:lang w:val="en-US"/>
+        </w:rPr>
+        <w:t>cin</w:t>
+      </w:r>
+      <w:proofErr w:type="spellEnd"/>
+      <w:r>
+        <w:rPr>
+          <w:rFonts w:ascii="Cascadia Mono" w:hAnsi="Cascadia Mono" w:cs="Cascadia Mono"/>
+          <w:color w:val="000000"/>
+          <w:sz w:val="28"/>
+          <w:szCs w:val="28"/>
+          <w:highlight w:val="white"/>
+          <w:lang w:val="en-US"/>
+        </w:rPr>
+        <w:t xml:space="preserve"> </w:t>
       </w:r>
       <w:r>
         <w:rPr>
@@ -12522,7 +12136,31 @@
           <w:highlight w:val="white"/>
           <w:lang w:val="en-US"/>
         </w:rPr>
-        <w:t xml:space="preserve"> porA;</w:t>
+        <w:t xml:space="preserve"> </w:t>
+      </w:r>
+      <w:proofErr w:type="spellStart"/>
+      <w:r>
+        <w:rPr>
+          <w:rFonts w:ascii="Cascadia Mono" w:hAnsi="Cascadia Mono" w:cs="Cascadia Mono"/>
+          <w:color w:val="000000"/>
+          <w:sz w:val="28"/>
+          <w:szCs w:val="28"/>
+          <w:highlight w:val="white"/>
+          <w:lang w:val="en-US"/>
+        </w:rPr>
+        <w:t>porA</w:t>
+      </w:r>
+      <w:proofErr w:type="spellEnd"/>
+      <w:r>
+        <w:rPr>
+          <w:rFonts w:ascii="Cascadia Mono" w:hAnsi="Cascadia Mono" w:cs="Cascadia Mono"/>
+          <w:color w:val="000000"/>
+          <w:sz w:val="28"/>
+          <w:szCs w:val="28"/>
+          <w:highlight w:val="white"/>
+          <w:lang w:val="en-US"/>
+        </w:rPr>
+        <w:t>;</w:t>
       </w:r>
     </w:p>
     <w:p>
@@ -12549,8 +12187,33 @@
           <w:highlight w:val="white"/>
           <w:lang w:val="en-US"/>
         </w:rPr>
-        <w:t xml:space="preserve">    pA = </w:t>
-      </w:r>
+        <w:t xml:space="preserve">    </w:t>
+      </w:r>
+      <w:proofErr w:type="spellStart"/>
+      <w:r>
+        <w:rPr>
+          <w:rFonts w:ascii="Cascadia Mono" w:hAnsi="Cascadia Mono" w:cs="Cascadia Mono"/>
+          <w:color w:val="000000"/>
+          <w:sz w:val="28"/>
+          <w:szCs w:val="28"/>
+          <w:highlight w:val="white"/>
+          <w:lang w:val="en-US"/>
+        </w:rPr>
+        <w:t>pA</w:t>
+      </w:r>
+      <w:proofErr w:type="spellEnd"/>
+      <w:r>
+        <w:rPr>
+          <w:rFonts w:ascii="Cascadia Mono" w:hAnsi="Cascadia Mono" w:cs="Cascadia Mono"/>
+          <w:color w:val="000000"/>
+          <w:sz w:val="28"/>
+          <w:szCs w:val="28"/>
+          <w:highlight w:val="white"/>
+          <w:lang w:val="en-US"/>
+        </w:rPr>
+        <w:t xml:space="preserve"> = </w:t>
+      </w:r>
+      <w:proofErr w:type="spellStart"/>
       <w:r>
         <w:rPr>
           <w:rFonts w:ascii="Cascadia Mono" w:hAnsi="Cascadia Mono" w:cs="Cascadia Mono"/>
@@ -12562,16 +12225,89 @@
         </w:rPr>
         <w:t>bitset</w:t>
       </w:r>
-      <w:r>
-        <w:rPr>
-          <w:rFonts w:ascii="Cascadia Mono" w:hAnsi="Cascadia Mono" w:cs="Cascadia Mono"/>
-          <w:color w:val="000000"/>
-          <w:sz w:val="28"/>
-          <w:szCs w:val="28"/>
-          <w:highlight w:val="white"/>
-          <w:lang w:val="en-US"/>
-        </w:rPr>
-        <w:t>&lt;8&gt;(porA).to_ulong();</w:t>
+      <w:proofErr w:type="spellEnd"/>
+      <w:r>
+        <w:rPr>
+          <w:rFonts w:ascii="Cascadia Mono" w:hAnsi="Cascadia Mono" w:cs="Cascadia Mono"/>
+          <w:color w:val="000000"/>
+          <w:sz w:val="28"/>
+          <w:szCs w:val="28"/>
+          <w:highlight w:val="white"/>
+          <w:lang w:val="en-US"/>
+        </w:rPr>
+        <w:t>&lt;8&gt;(</w:t>
+      </w:r>
+      <w:proofErr w:type="spellStart"/>
+      <w:r>
+        <w:rPr>
+          <w:rFonts w:ascii="Cascadia Mono" w:hAnsi="Cascadia Mono" w:cs="Cascadia Mono"/>
+          <w:color w:val="000000"/>
+          <w:sz w:val="28"/>
+          <w:szCs w:val="28"/>
+          <w:highlight w:val="white"/>
+          <w:lang w:val="en-US"/>
+        </w:rPr>
+        <w:t>porA</w:t>
+      </w:r>
+      <w:proofErr w:type="spellEnd"/>
+      <w:r>
+        <w:rPr>
+          <w:rFonts w:ascii="Cascadia Mono" w:hAnsi="Cascadia Mono" w:cs="Cascadia Mono"/>
+          <w:color w:val="000000"/>
+          <w:sz w:val="28"/>
+          <w:szCs w:val="28"/>
+          <w:highlight w:val="white"/>
+          <w:lang w:val="en-US"/>
+        </w:rPr>
+        <w:t>).</w:t>
+      </w:r>
+      <w:proofErr w:type="spellStart"/>
+      <w:r>
+        <w:rPr>
+          <w:rFonts w:ascii="Cascadia Mono" w:hAnsi="Cascadia Mono" w:cs="Cascadia Mono"/>
+          <w:color w:val="000000"/>
+          <w:sz w:val="28"/>
+          <w:szCs w:val="28"/>
+          <w:highlight w:val="white"/>
+          <w:lang w:val="en-US"/>
+        </w:rPr>
+        <w:t>to_</w:t>
+      </w:r>
+      <w:proofErr w:type="gramStart"/>
+      <w:r>
+        <w:rPr>
+          <w:rFonts w:ascii="Cascadia Mono" w:hAnsi="Cascadia Mono" w:cs="Cascadia Mono"/>
+          <w:color w:val="000000"/>
+          <w:sz w:val="28"/>
+          <w:szCs w:val="28"/>
+          <w:highlight w:val="white"/>
+          <w:lang w:val="en-US"/>
+        </w:rPr>
+        <w:t>ulong</w:t>
+      </w:r>
+      <w:proofErr w:type="spellEnd"/>
+      <w:r>
+        <w:rPr>
+          <w:rFonts w:ascii="Cascadia Mono" w:hAnsi="Cascadia Mono" w:cs="Cascadia Mono"/>
+          <w:color w:val="000000"/>
+          <w:sz w:val="28"/>
+          <w:szCs w:val="28"/>
+          <w:highlight w:val="white"/>
+          <w:lang w:val="en-US"/>
+        </w:rPr>
+        <w:t>(</w:t>
+      </w:r>
+      <w:proofErr w:type="gramEnd"/>
+      <w:r>
+        <w:rPr>
+          <w:rFonts w:ascii="Cascadia Mono" w:hAnsi="Cascadia Mono" w:cs="Cascadia Mono"/>
+          <w:color w:val="000000"/>
+          <w:sz w:val="28"/>
+          <w:szCs w:val="28"/>
+          <w:highlight w:val="white"/>
+          <w:lang w:val="en-US"/>
+        </w:rPr>
+        <w:t>);</w:t>
       </w:r>
     </w:p>
     <w:p>
@@ -12669,8 +12405,21 @@
           <w:highlight w:val="white"/>
           <w:lang w:val="en-US"/>
         </w:rPr>
-        <w:t>// mB</w:t>
-      </w:r>
+        <w:t xml:space="preserve">// </w:t>
+      </w:r>
+      <w:proofErr w:type="spellStart"/>
+      <w:r>
+        <w:rPr>
+          <w:rFonts w:ascii="Cascadia Mono" w:hAnsi="Cascadia Mono" w:cs="Cascadia Mono"/>
+          <w:color w:val="008000"/>
+          <w:sz w:val="28"/>
+          <w:szCs w:val="28"/>
+          <w:highlight w:val="white"/>
+          <w:lang w:val="en-US"/>
+        </w:rPr>
+        <w:t>mB</w:t>
+      </w:r>
+      <w:proofErr w:type="spellEnd"/>
     </w:p>
     <w:p>
       <w:pPr>
@@ -12712,7 +12461,31 @@
           <w:highlight w:val="white"/>
           <w:lang w:val="en-US"/>
         </w:rPr>
-        <w:t xml:space="preserve">    cout </w:t>
+        <w:t xml:space="preserve">    </w:t>
+      </w:r>
+      <w:proofErr w:type="spellStart"/>
+      <w:r>
+        <w:rPr>
+          <w:rFonts w:ascii="Cascadia Mono" w:hAnsi="Cascadia Mono" w:cs="Cascadia Mono"/>
+          <w:color w:val="000000"/>
+          <w:sz w:val="28"/>
+          <w:szCs w:val="28"/>
+          <w:highlight w:val="white"/>
+          <w:lang w:val="en-US"/>
+        </w:rPr>
+        <w:t>cout</w:t>
+      </w:r>
+      <w:proofErr w:type="spellEnd"/>
+      <w:r>
+        <w:rPr>
+          <w:rFonts w:ascii="Cascadia Mono" w:hAnsi="Cascadia Mono" w:cs="Cascadia Mono"/>
+          <w:color w:val="000000"/>
+          <w:sz w:val="28"/>
+          <w:szCs w:val="28"/>
+          <w:highlight w:val="white"/>
+          <w:lang w:val="en-US"/>
+        </w:rPr>
+        <w:t xml:space="preserve"> </w:t>
       </w:r>
       <w:r>
         <w:rPr>
@@ -12745,7 +12518,79 @@
           <w:highlight w:val="white"/>
           <w:lang w:val="en-US"/>
         </w:rPr>
-        <w:t>"Введите знаковый бит B: "</w:t>
+        <w:t>"</w:t>
+      </w:r>
+      <w:proofErr w:type="spellStart"/>
+      <w:r>
+        <w:rPr>
+          <w:rFonts w:ascii="Cascadia Mono" w:hAnsi="Cascadia Mono" w:cs="Cascadia Mono"/>
+          <w:color w:val="A31515"/>
+          <w:sz w:val="28"/>
+          <w:szCs w:val="28"/>
+          <w:highlight w:val="white"/>
+          <w:lang w:val="en-US"/>
+        </w:rPr>
+        <w:t>Введите</w:t>
+      </w:r>
+      <w:proofErr w:type="spellEnd"/>
+      <w:r>
+        <w:rPr>
+          <w:rFonts w:ascii="Cascadia Mono" w:hAnsi="Cascadia Mono" w:cs="Cascadia Mono"/>
+          <w:color w:val="A31515"/>
+          <w:sz w:val="28"/>
+          <w:szCs w:val="28"/>
+          <w:highlight w:val="white"/>
+          <w:lang w:val="en-US"/>
+        </w:rPr>
+        <w:t xml:space="preserve"> </w:t>
+      </w:r>
+      <w:proofErr w:type="spellStart"/>
+      <w:r>
+        <w:rPr>
+          <w:rFonts w:ascii="Cascadia Mono" w:hAnsi="Cascadia Mono" w:cs="Cascadia Mono"/>
+          <w:color w:val="A31515"/>
+          <w:sz w:val="28"/>
+          <w:szCs w:val="28"/>
+          <w:highlight w:val="white"/>
+          <w:lang w:val="en-US"/>
+        </w:rPr>
+        <w:t>знаковый</w:t>
+      </w:r>
+      <w:proofErr w:type="spellEnd"/>
+      <w:r>
+        <w:rPr>
+          <w:rFonts w:ascii="Cascadia Mono" w:hAnsi="Cascadia Mono" w:cs="Cascadia Mono"/>
+          <w:color w:val="A31515"/>
+          <w:sz w:val="28"/>
+          <w:szCs w:val="28"/>
+          <w:highlight w:val="white"/>
+          <w:lang w:val="en-US"/>
+        </w:rPr>
+        <w:t xml:space="preserve"> </w:t>
+      </w:r>
+      <w:proofErr w:type="spellStart"/>
+      <w:r>
+        <w:rPr>
+          <w:rFonts w:ascii="Cascadia Mono" w:hAnsi="Cascadia Mono" w:cs="Cascadia Mono"/>
+          <w:color w:val="A31515"/>
+          <w:sz w:val="28"/>
+          <w:szCs w:val="28"/>
+          <w:highlight w:val="white"/>
+          <w:lang w:val="en-US"/>
+        </w:rPr>
+        <w:t>бит</w:t>
+      </w:r>
+      <w:proofErr w:type="spellEnd"/>
+      <w:r>
+        <w:rPr>
+          <w:rFonts w:ascii="Cascadia Mono" w:hAnsi="Cascadia Mono" w:cs="Cascadia Mono"/>
+          <w:color w:val="A31515"/>
+          <w:sz w:val="28"/>
+          <w:szCs w:val="28"/>
+          <w:highlight w:val="white"/>
+          <w:lang w:val="en-US"/>
+        </w:rPr>
+        <w:t xml:space="preserve"> B: "</w:t>
       </w:r>
       <w:r>
         <w:rPr>
@@ -12805,7 +12650,31 @@
           <w:highlight w:val="white"/>
           <w:lang w:val="en-US"/>
         </w:rPr>
-        <w:t xml:space="preserve"> zB;</w:t>
+        <w:t xml:space="preserve"> </w:t>
+      </w:r>
+      <w:proofErr w:type="spellStart"/>
+      <w:r>
+        <w:rPr>
+          <w:rFonts w:ascii="Cascadia Mono" w:hAnsi="Cascadia Mono" w:cs="Cascadia Mono"/>
+          <w:color w:val="000000"/>
+          <w:sz w:val="28"/>
+          <w:szCs w:val="28"/>
+          <w:highlight w:val="white"/>
+          <w:lang w:val="en-US"/>
+        </w:rPr>
+        <w:t>zB</w:t>
+      </w:r>
+      <w:proofErr w:type="spellEnd"/>
+      <w:r>
+        <w:rPr>
+          <w:rFonts w:ascii="Cascadia Mono" w:hAnsi="Cascadia Mono" w:cs="Cascadia Mono"/>
+          <w:color w:val="000000"/>
+          <w:sz w:val="28"/>
+          <w:szCs w:val="28"/>
+          <w:highlight w:val="white"/>
+          <w:lang w:val="en-US"/>
+        </w:rPr>
+        <w:t>;</w:t>
       </w:r>
     </w:p>
     <w:p>
@@ -12832,7 +12701,31 @@
           <w:highlight w:val="white"/>
           <w:lang w:val="en-US"/>
         </w:rPr>
-        <w:t xml:space="preserve">    cin </w:t>
+        <w:t xml:space="preserve">    </w:t>
+      </w:r>
+      <w:proofErr w:type="spellStart"/>
+      <w:r>
+        <w:rPr>
+          <w:rFonts w:ascii="Cascadia Mono" w:hAnsi="Cascadia Mono" w:cs="Cascadia Mono"/>
+          <w:color w:val="000000"/>
+          <w:sz w:val="28"/>
+          <w:szCs w:val="28"/>
+          <w:highlight w:val="white"/>
+          <w:lang w:val="en-US"/>
+        </w:rPr>
+        <w:t>cin</w:t>
+      </w:r>
+      <w:proofErr w:type="spellEnd"/>
+      <w:r>
+        <w:rPr>
+          <w:rFonts w:ascii="Cascadia Mono" w:hAnsi="Cascadia Mono" w:cs="Cascadia Mono"/>
+          <w:color w:val="000000"/>
+          <w:sz w:val="28"/>
+          <w:szCs w:val="28"/>
+          <w:highlight w:val="white"/>
+          <w:lang w:val="en-US"/>
+        </w:rPr>
+        <w:t xml:space="preserve"> </w:t>
       </w:r>
       <w:r>
         <w:rPr>
@@ -12854,7 +12747,31 @@
           <w:highlight w:val="white"/>
           <w:lang w:val="en-US"/>
         </w:rPr>
-        <w:t xml:space="preserve"> zB;</w:t>
+        <w:t xml:space="preserve"> </w:t>
+      </w:r>
+      <w:proofErr w:type="spellStart"/>
+      <w:r>
+        <w:rPr>
+          <w:rFonts w:ascii="Cascadia Mono" w:hAnsi="Cascadia Mono" w:cs="Cascadia Mono"/>
+          <w:color w:val="000000"/>
+          <w:sz w:val="28"/>
+          <w:szCs w:val="28"/>
+          <w:highlight w:val="white"/>
+          <w:lang w:val="en-US"/>
+        </w:rPr>
+        <w:t>zB</w:t>
+      </w:r>
+      <w:proofErr w:type="spellEnd"/>
+      <w:r>
+        <w:rPr>
+          <w:rFonts w:ascii="Cascadia Mono" w:hAnsi="Cascadia Mono" w:cs="Cascadia Mono"/>
+          <w:color w:val="000000"/>
+          <w:sz w:val="28"/>
+          <w:szCs w:val="28"/>
+          <w:highlight w:val="white"/>
+          <w:lang w:val="en-US"/>
+        </w:rPr>
+        <w:t>;</w:t>
       </w:r>
     </w:p>
     <w:p>
@@ -12897,7 +12814,31 @@
           <w:highlight w:val="white"/>
           <w:lang w:val="en-US"/>
         </w:rPr>
-        <w:t xml:space="preserve">    cout </w:t>
+        <w:t xml:space="preserve">    </w:t>
+      </w:r>
+      <w:proofErr w:type="spellStart"/>
+      <w:r>
+        <w:rPr>
+          <w:rFonts w:ascii="Cascadia Mono" w:hAnsi="Cascadia Mono" w:cs="Cascadia Mono"/>
+          <w:color w:val="000000"/>
+          <w:sz w:val="28"/>
+          <w:szCs w:val="28"/>
+          <w:highlight w:val="white"/>
+          <w:lang w:val="en-US"/>
+        </w:rPr>
+        <w:t>cout</w:t>
+      </w:r>
+      <w:proofErr w:type="spellEnd"/>
+      <w:r>
+        <w:rPr>
+          <w:rFonts w:ascii="Cascadia Mono" w:hAnsi="Cascadia Mono" w:cs="Cascadia Mono"/>
+          <w:color w:val="000000"/>
+          <w:sz w:val="28"/>
+          <w:szCs w:val="28"/>
+          <w:highlight w:val="white"/>
+          <w:lang w:val="en-US"/>
+        </w:rPr>
+        <w:t xml:space="preserve"> </w:t>
       </w:r>
       <w:r>
         <w:rPr>
@@ -12930,7 +12871,79 @@
           <w:highlight w:val="white"/>
           <w:lang w:val="en-US"/>
         </w:rPr>
-        <w:t>"Введите мантиссу B (8 разрядов): "</w:t>
+        <w:t>"</w:t>
+      </w:r>
+      <w:proofErr w:type="spellStart"/>
+      <w:r>
+        <w:rPr>
+          <w:rFonts w:ascii="Cascadia Mono" w:hAnsi="Cascadia Mono" w:cs="Cascadia Mono"/>
+          <w:color w:val="A31515"/>
+          <w:sz w:val="28"/>
+          <w:szCs w:val="28"/>
+          <w:highlight w:val="white"/>
+          <w:lang w:val="en-US"/>
+        </w:rPr>
+        <w:t>Введите</w:t>
+      </w:r>
+      <w:proofErr w:type="spellEnd"/>
+      <w:r>
+        <w:rPr>
+          <w:rFonts w:ascii="Cascadia Mono" w:hAnsi="Cascadia Mono" w:cs="Cascadia Mono"/>
+          <w:color w:val="A31515"/>
+          <w:sz w:val="28"/>
+          <w:szCs w:val="28"/>
+          <w:highlight w:val="white"/>
+          <w:lang w:val="en-US"/>
+        </w:rPr>
+        <w:t xml:space="preserve"> </w:t>
+      </w:r>
+      <w:proofErr w:type="spellStart"/>
+      <w:r>
+        <w:rPr>
+          <w:rFonts w:ascii="Cascadia Mono" w:hAnsi="Cascadia Mono" w:cs="Cascadia Mono"/>
+          <w:color w:val="A31515"/>
+          <w:sz w:val="28"/>
+          <w:szCs w:val="28"/>
+          <w:highlight w:val="white"/>
+          <w:lang w:val="en-US"/>
+        </w:rPr>
+        <w:t>мантиссу</w:t>
+      </w:r>
+      <w:proofErr w:type="spellEnd"/>
+      <w:r>
+        <w:rPr>
+          <w:rFonts w:ascii="Cascadia Mono" w:hAnsi="Cascadia Mono" w:cs="Cascadia Mono"/>
+          <w:color w:val="A31515"/>
+          <w:sz w:val="28"/>
+          <w:szCs w:val="28"/>
+          <w:highlight w:val="white"/>
+          <w:lang w:val="en-US"/>
+        </w:rPr>
+        <w:t xml:space="preserve"> B (8 </w:t>
+      </w:r>
+      <w:proofErr w:type="spellStart"/>
+      <w:r>
+        <w:rPr>
+          <w:rFonts w:ascii="Cascadia Mono" w:hAnsi="Cascadia Mono" w:cs="Cascadia Mono"/>
+          <w:color w:val="A31515"/>
+          <w:sz w:val="28"/>
+          <w:szCs w:val="28"/>
+          <w:highlight w:val="white"/>
+          <w:lang w:val="en-US"/>
+        </w:rPr>
+        <w:t>разрядов</w:t>
+      </w:r>
+      <w:proofErr w:type="spellEnd"/>
+      <w:r>
+        <w:rPr>
+          <w:rFonts w:ascii="Cascadia Mono" w:hAnsi="Cascadia Mono" w:cs="Cascadia Mono"/>
+          <w:color w:val="A31515"/>
+          <w:sz w:val="28"/>
+          <w:szCs w:val="28"/>
+          <w:highlight w:val="white"/>
+          <w:lang w:val="en-US"/>
+        </w:rPr>
+        <w:t>): "</w:t>
       </w:r>
       <w:r>
         <w:rPr>
@@ -12990,7 +13003,31 @@
           <w:highlight w:val="white"/>
           <w:lang w:val="en-US"/>
         </w:rPr>
-        <w:t xml:space="preserve"> mB;</w:t>
+        <w:t xml:space="preserve"> </w:t>
+      </w:r>
+      <w:proofErr w:type="spellStart"/>
+      <w:r>
+        <w:rPr>
+          <w:rFonts w:ascii="Cascadia Mono" w:hAnsi="Cascadia Mono" w:cs="Cascadia Mono"/>
+          <w:color w:val="000000"/>
+          <w:sz w:val="28"/>
+          <w:szCs w:val="28"/>
+          <w:highlight w:val="white"/>
+          <w:lang w:val="en-US"/>
+        </w:rPr>
+        <w:t>mB</w:t>
+      </w:r>
+      <w:proofErr w:type="spellEnd"/>
+      <w:r>
+        <w:rPr>
+          <w:rFonts w:ascii="Cascadia Mono" w:hAnsi="Cascadia Mono" w:cs="Cascadia Mono"/>
+          <w:color w:val="000000"/>
+          <w:sz w:val="28"/>
+          <w:szCs w:val="28"/>
+          <w:highlight w:val="white"/>
+          <w:lang w:val="en-US"/>
+        </w:rPr>
+        <w:t>;</w:t>
       </w:r>
     </w:p>
     <w:p>
@@ -13017,7 +13054,31 @@
           <w:highlight w:val="white"/>
           <w:lang w:val="en-US"/>
         </w:rPr>
-        <w:t xml:space="preserve">    cin </w:t>
+        <w:t xml:space="preserve">    </w:t>
+      </w:r>
+      <w:proofErr w:type="spellStart"/>
+      <w:r>
+        <w:rPr>
+          <w:rFonts w:ascii="Cascadia Mono" w:hAnsi="Cascadia Mono" w:cs="Cascadia Mono"/>
+          <w:color w:val="000000"/>
+          <w:sz w:val="28"/>
+          <w:szCs w:val="28"/>
+          <w:highlight w:val="white"/>
+          <w:lang w:val="en-US"/>
+        </w:rPr>
+        <w:t>cin</w:t>
+      </w:r>
+      <w:proofErr w:type="spellEnd"/>
+      <w:r>
+        <w:rPr>
+          <w:rFonts w:ascii="Cascadia Mono" w:hAnsi="Cascadia Mono" w:cs="Cascadia Mono"/>
+          <w:color w:val="000000"/>
+          <w:sz w:val="28"/>
+          <w:szCs w:val="28"/>
+          <w:highlight w:val="white"/>
+          <w:lang w:val="en-US"/>
+        </w:rPr>
+        <w:t xml:space="preserve"> </w:t>
       </w:r>
       <w:r>
         <w:rPr>
@@ -13039,7 +13100,31 @@
           <w:highlight w:val="white"/>
           <w:lang w:val="en-US"/>
         </w:rPr>
-        <w:t xml:space="preserve"> mB;</w:t>
+        <w:t xml:space="preserve"> </w:t>
+      </w:r>
+      <w:proofErr w:type="spellStart"/>
+      <w:r>
+        <w:rPr>
+          <w:rFonts w:ascii="Cascadia Mono" w:hAnsi="Cascadia Mono" w:cs="Cascadia Mono"/>
+          <w:color w:val="000000"/>
+          <w:sz w:val="28"/>
+          <w:szCs w:val="28"/>
+          <w:highlight w:val="white"/>
+          <w:lang w:val="en-US"/>
+        </w:rPr>
+        <w:t>mB</w:t>
+      </w:r>
+      <w:proofErr w:type="spellEnd"/>
+      <w:r>
+        <w:rPr>
+          <w:rFonts w:ascii="Cascadia Mono" w:hAnsi="Cascadia Mono" w:cs="Cascadia Mono"/>
+          <w:color w:val="000000"/>
+          <w:sz w:val="28"/>
+          <w:szCs w:val="28"/>
+          <w:highlight w:val="white"/>
+          <w:lang w:val="en-US"/>
+        </w:rPr>
+        <w:t>;</w:t>
       </w:r>
     </w:p>
     <w:p>
@@ -13069,6 +13154,7 @@
         <w:lastRenderedPageBreak/>
         <w:t xml:space="preserve">    R1 = </w:t>
       </w:r>
+      <w:proofErr w:type="spellStart"/>
       <w:r>
         <w:rPr>
           <w:rFonts w:ascii="Cascadia Mono" w:hAnsi="Cascadia Mono" w:cs="Cascadia Mono"/>
@@ -13080,16 +13166,89 @@
         </w:rPr>
         <w:t>bitset</w:t>
       </w:r>
-      <w:r>
-        <w:rPr>
-          <w:rFonts w:ascii="Cascadia Mono" w:hAnsi="Cascadia Mono" w:cs="Cascadia Mono"/>
-          <w:color w:val="000000"/>
-          <w:sz w:val="28"/>
-          <w:szCs w:val="28"/>
-          <w:highlight w:val="white"/>
-          <w:lang w:val="en-US"/>
-        </w:rPr>
-        <w:t>&lt;8&gt;(mB).to_ulong();</w:t>
+      <w:proofErr w:type="spellEnd"/>
+      <w:r>
+        <w:rPr>
+          <w:rFonts w:ascii="Cascadia Mono" w:hAnsi="Cascadia Mono" w:cs="Cascadia Mono"/>
+          <w:color w:val="000000"/>
+          <w:sz w:val="28"/>
+          <w:szCs w:val="28"/>
+          <w:highlight w:val="white"/>
+          <w:lang w:val="en-US"/>
+        </w:rPr>
+        <w:t>&lt;8&gt;(</w:t>
+      </w:r>
+      <w:proofErr w:type="spellStart"/>
+      <w:r>
+        <w:rPr>
+          <w:rFonts w:ascii="Cascadia Mono" w:hAnsi="Cascadia Mono" w:cs="Cascadia Mono"/>
+          <w:color w:val="000000"/>
+          <w:sz w:val="28"/>
+          <w:szCs w:val="28"/>
+          <w:highlight w:val="white"/>
+          <w:lang w:val="en-US"/>
+        </w:rPr>
+        <w:t>mB</w:t>
+      </w:r>
+      <w:proofErr w:type="spellEnd"/>
+      <w:r>
+        <w:rPr>
+          <w:rFonts w:ascii="Cascadia Mono" w:hAnsi="Cascadia Mono" w:cs="Cascadia Mono"/>
+          <w:color w:val="000000"/>
+          <w:sz w:val="28"/>
+          <w:szCs w:val="28"/>
+          <w:highlight w:val="white"/>
+          <w:lang w:val="en-US"/>
+        </w:rPr>
+        <w:t>).</w:t>
+      </w:r>
+      <w:proofErr w:type="spellStart"/>
+      <w:r>
+        <w:rPr>
+          <w:rFonts w:ascii="Cascadia Mono" w:hAnsi="Cascadia Mono" w:cs="Cascadia Mono"/>
+          <w:color w:val="000000"/>
+          <w:sz w:val="28"/>
+          <w:szCs w:val="28"/>
+          <w:highlight w:val="white"/>
+          <w:lang w:val="en-US"/>
+        </w:rPr>
+        <w:t>to_</w:t>
+      </w:r>
+      <w:proofErr w:type="gramStart"/>
+      <w:r>
+        <w:rPr>
+          <w:rFonts w:ascii="Cascadia Mono" w:hAnsi="Cascadia Mono" w:cs="Cascadia Mono"/>
+          <w:color w:val="000000"/>
+          <w:sz w:val="28"/>
+          <w:szCs w:val="28"/>
+          <w:highlight w:val="white"/>
+          <w:lang w:val="en-US"/>
+        </w:rPr>
+        <w:t>ulong</w:t>
+      </w:r>
+      <w:proofErr w:type="spellEnd"/>
+      <w:r>
+        <w:rPr>
+          <w:rFonts w:ascii="Cascadia Mono" w:hAnsi="Cascadia Mono" w:cs="Cascadia Mono"/>
+          <w:color w:val="000000"/>
+          <w:sz w:val="28"/>
+          <w:szCs w:val="28"/>
+          <w:highlight w:val="white"/>
+          <w:lang w:val="en-US"/>
+        </w:rPr>
+        <w:t>(</w:t>
+      </w:r>
+      <w:proofErr w:type="gramEnd"/>
+      <w:r>
+        <w:rPr>
+          <w:rFonts w:ascii="Cascadia Mono" w:hAnsi="Cascadia Mono" w:cs="Cascadia Mono"/>
+          <w:color w:val="000000"/>
+          <w:sz w:val="28"/>
+          <w:szCs w:val="28"/>
+          <w:highlight w:val="white"/>
+          <w:lang w:val="en-US"/>
+        </w:rPr>
+        <w:t>);</w:t>
       </w:r>
     </w:p>
     <w:p>
@@ -13176,7 +13335,31 @@
           <w:highlight w:val="white"/>
           <w:lang w:val="en-US"/>
         </w:rPr>
-        <w:t xml:space="preserve"> pB; </w:t>
+        <w:t xml:space="preserve"> </w:t>
+      </w:r>
+      <w:proofErr w:type="spellStart"/>
+      <w:r>
+        <w:rPr>
+          <w:rFonts w:ascii="Cascadia Mono" w:hAnsi="Cascadia Mono" w:cs="Cascadia Mono"/>
+          <w:color w:val="000000"/>
+          <w:sz w:val="28"/>
+          <w:szCs w:val="28"/>
+          <w:highlight w:val="white"/>
+          <w:lang w:val="en-US"/>
+        </w:rPr>
+        <w:t>pB</w:t>
+      </w:r>
+      <w:proofErr w:type="spellEnd"/>
+      <w:r>
+        <w:rPr>
+          <w:rFonts w:ascii="Cascadia Mono" w:hAnsi="Cascadia Mono" w:cs="Cascadia Mono"/>
+          <w:color w:val="000000"/>
+          <w:sz w:val="28"/>
+          <w:szCs w:val="28"/>
+          <w:highlight w:val="white"/>
+          <w:lang w:val="en-US"/>
+        </w:rPr>
+        <w:t xml:space="preserve">; </w:t>
       </w:r>
       <w:r>
         <w:rPr>
@@ -13187,7 +13370,31 @@
           <w:highlight w:val="white"/>
           <w:lang w:val="en-US"/>
         </w:rPr>
-        <w:t xml:space="preserve">// pB </w:t>
+        <w:t xml:space="preserve">// </w:t>
+      </w:r>
+      <w:proofErr w:type="spellStart"/>
+      <w:r>
+        <w:rPr>
+          <w:rFonts w:ascii="Cascadia Mono" w:hAnsi="Cascadia Mono" w:cs="Cascadia Mono"/>
+          <w:color w:val="008000"/>
+          <w:sz w:val="28"/>
+          <w:szCs w:val="28"/>
+          <w:highlight w:val="white"/>
+          <w:lang w:val="en-US"/>
+        </w:rPr>
+        <w:t>pB</w:t>
+      </w:r>
+      <w:proofErr w:type="spellEnd"/>
+      <w:r>
+        <w:rPr>
+          <w:rFonts w:ascii="Cascadia Mono" w:hAnsi="Cascadia Mono" w:cs="Cascadia Mono"/>
+          <w:color w:val="008000"/>
+          <w:sz w:val="28"/>
+          <w:szCs w:val="28"/>
+          <w:highlight w:val="white"/>
+          <w:lang w:val="en-US"/>
+        </w:rPr>
+        <w:t xml:space="preserve"> </w:t>
       </w:r>
     </w:p>
     <w:p>
@@ -13230,7 +13437,31 @@
           <w:highlight w:val="white"/>
           <w:lang w:val="en-US"/>
         </w:rPr>
-        <w:t xml:space="preserve">    cout </w:t>
+        <w:t xml:space="preserve">    </w:t>
+      </w:r>
+      <w:proofErr w:type="spellStart"/>
+      <w:r>
+        <w:rPr>
+          <w:rFonts w:ascii="Cascadia Mono" w:hAnsi="Cascadia Mono" w:cs="Cascadia Mono"/>
+          <w:color w:val="000000"/>
+          <w:sz w:val="28"/>
+          <w:szCs w:val="28"/>
+          <w:highlight w:val="white"/>
+          <w:lang w:val="en-US"/>
+        </w:rPr>
+        <w:t>cout</w:t>
+      </w:r>
+      <w:proofErr w:type="spellEnd"/>
+      <w:r>
+        <w:rPr>
+          <w:rFonts w:ascii="Cascadia Mono" w:hAnsi="Cascadia Mono" w:cs="Cascadia Mono"/>
+          <w:color w:val="000000"/>
+          <w:sz w:val="28"/>
+          <w:szCs w:val="28"/>
+          <w:highlight w:val="white"/>
+          <w:lang w:val="en-US"/>
+        </w:rPr>
+        <w:t xml:space="preserve"> </w:t>
       </w:r>
       <w:r>
         <w:rPr>
@@ -13263,7 +13494,103 @@
           <w:highlight w:val="white"/>
           <w:lang w:val="en-US"/>
         </w:rPr>
-        <w:t>"Введите порядок pB (5 разрядов): "</w:t>
+        <w:t>"</w:t>
+      </w:r>
+      <w:proofErr w:type="spellStart"/>
+      <w:r>
+        <w:rPr>
+          <w:rFonts w:ascii="Cascadia Mono" w:hAnsi="Cascadia Mono" w:cs="Cascadia Mono"/>
+          <w:color w:val="A31515"/>
+          <w:sz w:val="28"/>
+          <w:szCs w:val="28"/>
+          <w:highlight w:val="white"/>
+          <w:lang w:val="en-US"/>
+        </w:rPr>
+        <w:t>Введите</w:t>
+      </w:r>
+      <w:proofErr w:type="spellEnd"/>
+      <w:r>
+        <w:rPr>
+          <w:rFonts w:ascii="Cascadia Mono" w:hAnsi="Cascadia Mono" w:cs="Cascadia Mono"/>
+          <w:color w:val="A31515"/>
+          <w:sz w:val="28"/>
+          <w:szCs w:val="28"/>
+          <w:highlight w:val="white"/>
+          <w:lang w:val="en-US"/>
+        </w:rPr>
+        <w:t xml:space="preserve"> </w:t>
+      </w:r>
+      <w:proofErr w:type="spellStart"/>
+      <w:r>
+        <w:rPr>
+          <w:rFonts w:ascii="Cascadia Mono" w:hAnsi="Cascadia Mono" w:cs="Cascadia Mono"/>
+          <w:color w:val="A31515"/>
+          <w:sz w:val="28"/>
+          <w:szCs w:val="28"/>
+          <w:highlight w:val="white"/>
+          <w:lang w:val="en-US"/>
+        </w:rPr>
+        <w:t>порядок</w:t>
+      </w:r>
+      <w:proofErr w:type="spellEnd"/>
+      <w:r>
+        <w:rPr>
+          <w:rFonts w:ascii="Cascadia Mono" w:hAnsi="Cascadia Mono" w:cs="Cascadia Mono"/>
+          <w:color w:val="A31515"/>
+          <w:sz w:val="28"/>
+          <w:szCs w:val="28"/>
+          <w:highlight w:val="white"/>
+          <w:lang w:val="en-US"/>
+        </w:rPr>
+        <w:t xml:space="preserve"> </w:t>
+      </w:r>
+      <w:proofErr w:type="spellStart"/>
+      <w:r>
+        <w:rPr>
+          <w:rFonts w:ascii="Cascadia Mono" w:hAnsi="Cascadia Mono" w:cs="Cascadia Mono"/>
+          <w:color w:val="A31515"/>
+          <w:sz w:val="28"/>
+          <w:szCs w:val="28"/>
+          <w:highlight w:val="white"/>
+          <w:lang w:val="en-US"/>
+        </w:rPr>
+        <w:t>pB</w:t>
+      </w:r>
+      <w:proofErr w:type="spellEnd"/>
+      <w:r>
+        <w:rPr>
+          <w:rFonts w:ascii="Cascadia Mono" w:hAnsi="Cascadia Mono" w:cs="Cascadia Mono"/>
+          <w:color w:val="A31515"/>
+          <w:sz w:val="28"/>
+          <w:szCs w:val="28"/>
+          <w:highlight w:val="white"/>
+          <w:lang w:val="en-US"/>
+        </w:rPr>
+        <w:t xml:space="preserve"> (5 </w:t>
+      </w:r>
+      <w:proofErr w:type="spellStart"/>
+      <w:r>
+        <w:rPr>
+          <w:rFonts w:ascii="Cascadia Mono" w:hAnsi="Cascadia Mono" w:cs="Cascadia Mono"/>
+          <w:color w:val="A31515"/>
+          <w:sz w:val="28"/>
+          <w:szCs w:val="28"/>
+          <w:highlight w:val="white"/>
+          <w:lang w:val="en-US"/>
+        </w:rPr>
+        <w:t>разрядов</w:t>
+      </w:r>
+      <w:proofErr w:type="spellEnd"/>
+      <w:r>
+        <w:rPr>
+          <w:rFonts w:ascii="Cascadia Mono" w:hAnsi="Cascadia Mono" w:cs="Cascadia Mono"/>
+          <w:color w:val="A31515"/>
+          <w:sz w:val="28"/>
+          <w:szCs w:val="28"/>
+          <w:highlight w:val="white"/>
+          <w:lang w:val="en-US"/>
+        </w:rPr>
+        <w:t>): "</w:t>
       </w:r>
       <w:r>
         <w:rPr>
@@ -13323,7 +13650,31 @@
           <w:highlight w:val="white"/>
           <w:lang w:val="en-US"/>
         </w:rPr>
-        <w:t xml:space="preserve"> porB;</w:t>
+        <w:t xml:space="preserve"> </w:t>
+      </w:r>
+      <w:proofErr w:type="spellStart"/>
+      <w:r>
+        <w:rPr>
+          <w:rFonts w:ascii="Cascadia Mono" w:hAnsi="Cascadia Mono" w:cs="Cascadia Mono"/>
+          <w:color w:val="000000"/>
+          <w:sz w:val="28"/>
+          <w:szCs w:val="28"/>
+          <w:highlight w:val="white"/>
+          <w:lang w:val="en-US"/>
+        </w:rPr>
+        <w:t>porB</w:t>
+      </w:r>
+      <w:proofErr w:type="spellEnd"/>
+      <w:r>
+        <w:rPr>
+          <w:rFonts w:ascii="Cascadia Mono" w:hAnsi="Cascadia Mono" w:cs="Cascadia Mono"/>
+          <w:color w:val="000000"/>
+          <w:sz w:val="28"/>
+          <w:szCs w:val="28"/>
+          <w:highlight w:val="white"/>
+          <w:lang w:val="en-US"/>
+        </w:rPr>
+        <w:t>;</w:t>
       </w:r>
     </w:p>
     <w:p>
@@ -13350,7 +13701,31 @@
           <w:highlight w:val="white"/>
           <w:lang w:val="en-US"/>
         </w:rPr>
-        <w:t xml:space="preserve">    cin </w:t>
+        <w:t xml:space="preserve">    </w:t>
+      </w:r>
+      <w:proofErr w:type="spellStart"/>
+      <w:r>
+        <w:rPr>
+          <w:rFonts w:ascii="Cascadia Mono" w:hAnsi="Cascadia Mono" w:cs="Cascadia Mono"/>
+          <w:color w:val="000000"/>
+          <w:sz w:val="28"/>
+          <w:szCs w:val="28"/>
+          <w:highlight w:val="white"/>
+          <w:lang w:val="en-US"/>
+        </w:rPr>
+        <w:t>cin</w:t>
+      </w:r>
+      <w:proofErr w:type="spellEnd"/>
+      <w:r>
+        <w:rPr>
+          <w:rFonts w:ascii="Cascadia Mono" w:hAnsi="Cascadia Mono" w:cs="Cascadia Mono"/>
+          <w:color w:val="000000"/>
+          <w:sz w:val="28"/>
+          <w:szCs w:val="28"/>
+          <w:highlight w:val="white"/>
+          <w:lang w:val="en-US"/>
+        </w:rPr>
+        <w:t xml:space="preserve"> </w:t>
       </w:r>
       <w:r>
         <w:rPr>
@@ -13372,7 +13747,31 @@
           <w:highlight w:val="white"/>
           <w:lang w:val="en-US"/>
         </w:rPr>
-        <w:t xml:space="preserve"> porB;</w:t>
+        <w:t xml:space="preserve"> </w:t>
+      </w:r>
+      <w:proofErr w:type="spellStart"/>
+      <w:r>
+        <w:rPr>
+          <w:rFonts w:ascii="Cascadia Mono" w:hAnsi="Cascadia Mono" w:cs="Cascadia Mono"/>
+          <w:color w:val="000000"/>
+          <w:sz w:val="28"/>
+          <w:szCs w:val="28"/>
+          <w:highlight w:val="white"/>
+          <w:lang w:val="en-US"/>
+        </w:rPr>
+        <w:t>porB</w:t>
+      </w:r>
+      <w:proofErr w:type="spellEnd"/>
+      <w:r>
+        <w:rPr>
+          <w:rFonts w:ascii="Cascadia Mono" w:hAnsi="Cascadia Mono" w:cs="Cascadia Mono"/>
+          <w:color w:val="000000"/>
+          <w:sz w:val="28"/>
+          <w:szCs w:val="28"/>
+          <w:highlight w:val="white"/>
+          <w:lang w:val="en-US"/>
+        </w:rPr>
+        <w:t>;</w:t>
       </w:r>
     </w:p>
     <w:p>
@@ -13399,8 +13798,33 @@
           <w:highlight w:val="white"/>
           <w:lang w:val="en-US"/>
         </w:rPr>
-        <w:t xml:space="preserve">    pB = </w:t>
-      </w:r>
+        <w:t xml:space="preserve">    </w:t>
+      </w:r>
+      <w:proofErr w:type="spellStart"/>
+      <w:r>
+        <w:rPr>
+          <w:rFonts w:ascii="Cascadia Mono" w:hAnsi="Cascadia Mono" w:cs="Cascadia Mono"/>
+          <w:color w:val="000000"/>
+          <w:sz w:val="28"/>
+          <w:szCs w:val="28"/>
+          <w:highlight w:val="white"/>
+          <w:lang w:val="en-US"/>
+        </w:rPr>
+        <w:t>pB</w:t>
+      </w:r>
+      <w:proofErr w:type="spellEnd"/>
+      <w:r>
+        <w:rPr>
+          <w:rFonts w:ascii="Cascadia Mono" w:hAnsi="Cascadia Mono" w:cs="Cascadia Mono"/>
+          <w:color w:val="000000"/>
+          <w:sz w:val="28"/>
+          <w:szCs w:val="28"/>
+          <w:highlight w:val="white"/>
+          <w:lang w:val="en-US"/>
+        </w:rPr>
+        <w:t xml:space="preserve"> = </w:t>
+      </w:r>
+      <w:proofErr w:type="spellStart"/>
       <w:r>
         <w:rPr>
           <w:rFonts w:ascii="Cascadia Mono" w:hAnsi="Cascadia Mono" w:cs="Cascadia Mono"/>
@@ -13412,16 +13836,89 @@
         </w:rPr>
         <w:t>bitset</w:t>
       </w:r>
-      <w:r>
-        <w:rPr>
-          <w:rFonts w:ascii="Cascadia Mono" w:hAnsi="Cascadia Mono" w:cs="Cascadia Mono"/>
-          <w:color w:val="000000"/>
-          <w:sz w:val="28"/>
-          <w:szCs w:val="28"/>
-          <w:highlight w:val="white"/>
-          <w:lang w:val="en-US"/>
-        </w:rPr>
-        <w:t>&lt;8&gt;(porB).to_ulong();</w:t>
+      <w:proofErr w:type="spellEnd"/>
+      <w:r>
+        <w:rPr>
+          <w:rFonts w:ascii="Cascadia Mono" w:hAnsi="Cascadia Mono" w:cs="Cascadia Mono"/>
+          <w:color w:val="000000"/>
+          <w:sz w:val="28"/>
+          <w:szCs w:val="28"/>
+          <w:highlight w:val="white"/>
+          <w:lang w:val="en-US"/>
+        </w:rPr>
+        <w:t>&lt;8&gt;(</w:t>
+      </w:r>
+      <w:proofErr w:type="spellStart"/>
+      <w:r>
+        <w:rPr>
+          <w:rFonts w:ascii="Cascadia Mono" w:hAnsi="Cascadia Mono" w:cs="Cascadia Mono"/>
+          <w:color w:val="000000"/>
+          <w:sz w:val="28"/>
+          <w:szCs w:val="28"/>
+          <w:highlight w:val="white"/>
+          <w:lang w:val="en-US"/>
+        </w:rPr>
+        <w:t>porB</w:t>
+      </w:r>
+      <w:proofErr w:type="spellEnd"/>
+      <w:r>
+        <w:rPr>
+          <w:rFonts w:ascii="Cascadia Mono" w:hAnsi="Cascadia Mono" w:cs="Cascadia Mono"/>
+          <w:color w:val="000000"/>
+          <w:sz w:val="28"/>
+          <w:szCs w:val="28"/>
+          <w:highlight w:val="white"/>
+          <w:lang w:val="en-US"/>
+        </w:rPr>
+        <w:t>).</w:t>
+      </w:r>
+      <w:proofErr w:type="spellStart"/>
+      <w:r>
+        <w:rPr>
+          <w:rFonts w:ascii="Cascadia Mono" w:hAnsi="Cascadia Mono" w:cs="Cascadia Mono"/>
+          <w:color w:val="000000"/>
+          <w:sz w:val="28"/>
+          <w:szCs w:val="28"/>
+          <w:highlight w:val="white"/>
+          <w:lang w:val="en-US"/>
+        </w:rPr>
+        <w:t>to_</w:t>
+      </w:r>
+      <w:proofErr w:type="gramStart"/>
+      <w:r>
+        <w:rPr>
+          <w:rFonts w:ascii="Cascadia Mono" w:hAnsi="Cascadia Mono" w:cs="Cascadia Mono"/>
+          <w:color w:val="000000"/>
+          <w:sz w:val="28"/>
+          <w:szCs w:val="28"/>
+          <w:highlight w:val="white"/>
+          <w:lang w:val="en-US"/>
+        </w:rPr>
+        <w:t>ulong</w:t>
+      </w:r>
+      <w:proofErr w:type="spellEnd"/>
+      <w:r>
+        <w:rPr>
+          <w:rFonts w:ascii="Cascadia Mono" w:hAnsi="Cascadia Mono" w:cs="Cascadia Mono"/>
+          <w:color w:val="000000"/>
+          <w:sz w:val="28"/>
+          <w:szCs w:val="28"/>
+          <w:highlight w:val="white"/>
+          <w:lang w:val="en-US"/>
+        </w:rPr>
+        <w:t>(</w:t>
+      </w:r>
+      <w:proofErr w:type="gramEnd"/>
+      <w:r>
+        <w:rPr>
+          <w:rFonts w:ascii="Cascadia Mono" w:hAnsi="Cascadia Mono" w:cs="Cascadia Mono"/>
+          <w:color w:val="000000"/>
+          <w:sz w:val="28"/>
+          <w:szCs w:val="28"/>
+          <w:highlight w:val="white"/>
+          <w:lang w:val="en-US"/>
+        </w:rPr>
+        <w:t>);</w:t>
       </w:r>
     </w:p>
     <w:p>
@@ -13508,7 +14005,79 @@
           <w:highlight w:val="white"/>
           <w:lang w:val="en-US"/>
         </w:rPr>
-        <w:t xml:space="preserve"> pC = pA + pB;</w:t>
+        <w:t xml:space="preserve"> </w:t>
+      </w:r>
+      <w:proofErr w:type="spellStart"/>
+      <w:r>
+        <w:rPr>
+          <w:rFonts w:ascii="Cascadia Mono" w:hAnsi="Cascadia Mono" w:cs="Cascadia Mono"/>
+          <w:color w:val="000000"/>
+          <w:sz w:val="28"/>
+          <w:szCs w:val="28"/>
+          <w:highlight w:val="white"/>
+          <w:lang w:val="en-US"/>
+        </w:rPr>
+        <w:t>pC</w:t>
+      </w:r>
+      <w:proofErr w:type="spellEnd"/>
+      <w:r>
+        <w:rPr>
+          <w:rFonts w:ascii="Cascadia Mono" w:hAnsi="Cascadia Mono" w:cs="Cascadia Mono"/>
+          <w:color w:val="000000"/>
+          <w:sz w:val="28"/>
+          <w:szCs w:val="28"/>
+          <w:highlight w:val="white"/>
+          <w:lang w:val="en-US"/>
+        </w:rPr>
+        <w:t xml:space="preserve"> = </w:t>
+      </w:r>
+      <w:proofErr w:type="spellStart"/>
+      <w:r>
+        <w:rPr>
+          <w:rFonts w:ascii="Cascadia Mono" w:hAnsi="Cascadia Mono" w:cs="Cascadia Mono"/>
+          <w:color w:val="000000"/>
+          <w:sz w:val="28"/>
+          <w:szCs w:val="28"/>
+          <w:highlight w:val="white"/>
+          <w:lang w:val="en-US"/>
+        </w:rPr>
+        <w:t>pA</w:t>
+      </w:r>
+      <w:proofErr w:type="spellEnd"/>
+      <w:r>
+        <w:rPr>
+          <w:rFonts w:ascii="Cascadia Mono" w:hAnsi="Cascadia Mono" w:cs="Cascadia Mono"/>
+          <w:color w:val="000000"/>
+          <w:sz w:val="28"/>
+          <w:szCs w:val="28"/>
+          <w:highlight w:val="white"/>
+          <w:lang w:val="en-US"/>
+        </w:rPr>
+        <w:t xml:space="preserve"> + </w:t>
+      </w:r>
+      <w:proofErr w:type="spellStart"/>
+      <w:r>
+        <w:rPr>
+          <w:rFonts w:ascii="Cascadia Mono" w:hAnsi="Cascadia Mono" w:cs="Cascadia Mono"/>
+          <w:color w:val="000000"/>
+          <w:sz w:val="28"/>
+          <w:szCs w:val="28"/>
+          <w:highlight w:val="white"/>
+          <w:lang w:val="en-US"/>
+        </w:rPr>
+        <w:t>pB</w:t>
+      </w:r>
+      <w:proofErr w:type="spellEnd"/>
+      <w:r>
+        <w:rPr>
+          <w:rFonts w:ascii="Cascadia Mono" w:hAnsi="Cascadia Mono" w:cs="Cascadia Mono"/>
+          <w:color w:val="000000"/>
+          <w:sz w:val="28"/>
+          <w:szCs w:val="28"/>
+          <w:highlight w:val="white"/>
+          <w:lang w:val="en-US"/>
+        </w:rPr>
+        <w:t>;</w:t>
       </w:r>
     </w:p>
     <w:p>
@@ -13752,7 +14321,31 @@
           <w:highlight w:val="white"/>
           <w:lang w:val="en-US"/>
         </w:rPr>
-        <w:t xml:space="preserve">            lastbit = </w:t>
+        <w:t xml:space="preserve">            </w:t>
+      </w:r>
+      <w:proofErr w:type="spellStart"/>
+      <w:r>
+        <w:rPr>
+          <w:rFonts w:ascii="Cascadia Mono" w:hAnsi="Cascadia Mono" w:cs="Cascadia Mono"/>
+          <w:color w:val="000000"/>
+          <w:sz w:val="28"/>
+          <w:szCs w:val="28"/>
+          <w:highlight w:val="white"/>
+          <w:lang w:val="en-US"/>
+        </w:rPr>
+        <w:t>lastbit</w:t>
+      </w:r>
+      <w:proofErr w:type="spellEnd"/>
+      <w:r>
+        <w:rPr>
+          <w:rFonts w:ascii="Cascadia Mono" w:hAnsi="Cascadia Mono" w:cs="Cascadia Mono"/>
+          <w:color w:val="000000"/>
+          <w:sz w:val="28"/>
+          <w:szCs w:val="28"/>
+          <w:highlight w:val="white"/>
+          <w:lang w:val="en-US"/>
+        </w:rPr>
+        <w:t xml:space="preserve"> = </w:t>
       </w:r>
       <w:r>
         <w:rPr>
@@ -13877,7 +14470,31 @@
           <w:highlight w:val="white"/>
           <w:lang w:val="en-US"/>
         </w:rPr>
-        <w:t xml:space="preserve">            lastbit = </w:t>
+        <w:t xml:space="preserve">            </w:t>
+      </w:r>
+      <w:proofErr w:type="spellStart"/>
+      <w:r>
+        <w:rPr>
+          <w:rFonts w:ascii="Cascadia Mono" w:hAnsi="Cascadia Mono" w:cs="Cascadia Mono"/>
+          <w:color w:val="000000"/>
+          <w:sz w:val="28"/>
+          <w:szCs w:val="28"/>
+          <w:highlight w:val="white"/>
+          <w:lang w:val="en-US"/>
+        </w:rPr>
+        <w:t>lastbit</w:t>
+      </w:r>
+      <w:proofErr w:type="spellEnd"/>
+      <w:r>
+        <w:rPr>
+          <w:rFonts w:ascii="Cascadia Mono" w:hAnsi="Cascadia Mono" w:cs="Cascadia Mono"/>
+          <w:color w:val="000000"/>
+          <w:sz w:val="28"/>
+          <w:szCs w:val="28"/>
+          <w:highlight w:val="white"/>
+          <w:lang w:val="en-US"/>
+        </w:rPr>
+        <w:t xml:space="preserve"> = </w:t>
       </w:r>
       <w:r>
         <w:rPr>
@@ -14018,7 +14635,31 @@
           <w:highlight w:val="white"/>
           <w:lang w:val="en-US"/>
         </w:rPr>
-        <w:t xml:space="preserve"> ((SM &amp; 0b10000000) == lastbit) {</w:t>
+        <w:t xml:space="preserve"> ((SM &amp; 0b10000000) == </w:t>
+      </w:r>
+      <w:proofErr w:type="spellStart"/>
+      <w:r>
+        <w:rPr>
+          <w:rFonts w:ascii="Cascadia Mono" w:hAnsi="Cascadia Mono" w:cs="Cascadia Mono"/>
+          <w:color w:val="000000"/>
+          <w:sz w:val="28"/>
+          <w:szCs w:val="28"/>
+          <w:highlight w:val="white"/>
+          <w:lang w:val="en-US"/>
+        </w:rPr>
+        <w:t>lastbit</w:t>
+      </w:r>
+      <w:proofErr w:type="spellEnd"/>
+      <w:r>
+        <w:rPr>
+          <w:rFonts w:ascii="Cascadia Mono" w:hAnsi="Cascadia Mono" w:cs="Cascadia Mono"/>
+          <w:color w:val="000000"/>
+          <w:sz w:val="28"/>
+          <w:szCs w:val="28"/>
+          <w:highlight w:val="white"/>
+          <w:lang w:val="en-US"/>
+        </w:rPr>
+        <w:t>) {</w:t>
       </w:r>
     </w:p>
     <w:p>
@@ -14067,7 +14708,31 @@
           <w:highlight w:val="white"/>
           <w:lang w:val="en-US"/>
         </w:rPr>
-        <w:t xml:space="preserve"> ((SM &amp; 0b10000000) == lastbit) {</w:t>
+        <w:t xml:space="preserve"> ((SM &amp; 0b10000000) == </w:t>
+      </w:r>
+      <w:proofErr w:type="spellStart"/>
+      <w:r>
+        <w:rPr>
+          <w:rFonts w:ascii="Cascadia Mono" w:hAnsi="Cascadia Mono" w:cs="Cascadia Mono"/>
+          <w:color w:val="000000"/>
+          <w:sz w:val="28"/>
+          <w:szCs w:val="28"/>
+          <w:highlight w:val="white"/>
+          <w:lang w:val="en-US"/>
+        </w:rPr>
+        <w:t>lastbit</w:t>
+      </w:r>
+      <w:proofErr w:type="spellEnd"/>
+      <w:r>
+        <w:rPr>
+          <w:rFonts w:ascii="Cascadia Mono" w:hAnsi="Cascadia Mono" w:cs="Cascadia Mono"/>
+          <w:color w:val="000000"/>
+          <w:sz w:val="28"/>
+          <w:szCs w:val="28"/>
+          <w:highlight w:val="white"/>
+          <w:lang w:val="en-US"/>
+        </w:rPr>
+        <w:t>) {</w:t>
       </w:r>
     </w:p>
     <w:p>
@@ -14121,7 +14786,55 @@
           <w:highlight w:val="white"/>
           <w:lang w:val="en-US"/>
         </w:rPr>
-        <w:t xml:space="preserve">            pC = pC + 1;</w:t>
+        <w:t xml:space="preserve">            </w:t>
+      </w:r>
+      <w:proofErr w:type="spellStart"/>
+      <w:r>
+        <w:rPr>
+          <w:rFonts w:ascii="Cascadia Mono" w:hAnsi="Cascadia Mono" w:cs="Cascadia Mono"/>
+          <w:color w:val="000000"/>
+          <w:sz w:val="28"/>
+          <w:szCs w:val="28"/>
+          <w:highlight w:val="white"/>
+          <w:lang w:val="en-US"/>
+        </w:rPr>
+        <w:t>pC</w:t>
+      </w:r>
+      <w:proofErr w:type="spellEnd"/>
+      <w:r>
+        <w:rPr>
+          <w:rFonts w:ascii="Cascadia Mono" w:hAnsi="Cascadia Mono" w:cs="Cascadia Mono"/>
+          <w:color w:val="000000"/>
+          <w:sz w:val="28"/>
+          <w:szCs w:val="28"/>
+          <w:highlight w:val="white"/>
+          <w:lang w:val="en-US"/>
+        </w:rPr>
+        <w:t xml:space="preserve"> = </w:t>
+      </w:r>
+      <w:proofErr w:type="spellStart"/>
+      <w:r>
+        <w:rPr>
+          <w:rFonts w:ascii="Cascadia Mono" w:hAnsi="Cascadia Mono" w:cs="Cascadia Mono"/>
+          <w:color w:val="000000"/>
+          <w:sz w:val="28"/>
+          <w:szCs w:val="28"/>
+          <w:highlight w:val="white"/>
+          <w:lang w:val="en-US"/>
+        </w:rPr>
+        <w:t>pC</w:t>
+      </w:r>
+      <w:proofErr w:type="spellEnd"/>
+      <w:r>
+        <w:rPr>
+          <w:rFonts w:ascii="Cascadia Mono" w:hAnsi="Cascadia Mono" w:cs="Cascadia Mono"/>
+          <w:color w:val="000000"/>
+          <w:sz w:val="28"/>
+          <w:szCs w:val="28"/>
+          <w:highlight w:val="white"/>
+          <w:lang w:val="en-US"/>
+        </w:rPr>
+        <w:t xml:space="preserve"> + 1;</w:t>
       </w:r>
     </w:p>
     <w:p>
@@ -14251,7 +14964,31 @@
           <w:highlight w:val="white"/>
           <w:lang w:val="en-US"/>
         </w:rPr>
-        <w:t xml:space="preserve"> (lastbit == </w:t>
+        <w:t xml:space="preserve"> (</w:t>
+      </w:r>
+      <w:proofErr w:type="spellStart"/>
+      <w:r>
+        <w:rPr>
+          <w:rFonts w:ascii="Cascadia Mono" w:hAnsi="Cascadia Mono" w:cs="Cascadia Mono"/>
+          <w:color w:val="000000"/>
+          <w:sz w:val="28"/>
+          <w:szCs w:val="28"/>
+          <w:highlight w:val="white"/>
+          <w:lang w:val="en-US"/>
+        </w:rPr>
+        <w:t>lastbit</w:t>
+      </w:r>
+      <w:proofErr w:type="spellEnd"/>
+      <w:r>
+        <w:rPr>
+          <w:rFonts w:ascii="Cascadia Mono" w:hAnsi="Cascadia Mono" w:cs="Cascadia Mono"/>
+          <w:color w:val="000000"/>
+          <w:sz w:val="28"/>
+          <w:szCs w:val="28"/>
+          <w:highlight w:val="white"/>
+          <w:lang w:val="en-US"/>
+        </w:rPr>
+        <w:t xml:space="preserve"> == </w:t>
       </w:r>
       <w:r>
         <w:rPr>
@@ -14300,7 +15037,31 @@
           <w:highlight w:val="white"/>
           <w:lang w:val="en-US"/>
         </w:rPr>
-        <w:t xml:space="preserve">        cout </w:t>
+        <w:t xml:space="preserve">        </w:t>
+      </w:r>
+      <w:proofErr w:type="spellStart"/>
+      <w:r>
+        <w:rPr>
+          <w:rFonts w:ascii="Cascadia Mono" w:hAnsi="Cascadia Mono" w:cs="Cascadia Mono"/>
+          <w:color w:val="000000"/>
+          <w:sz w:val="28"/>
+          <w:szCs w:val="28"/>
+          <w:highlight w:val="white"/>
+          <w:lang w:val="en-US"/>
+        </w:rPr>
+        <w:t>cout</w:t>
+      </w:r>
+      <w:proofErr w:type="spellEnd"/>
+      <w:r>
+        <w:rPr>
+          <w:rFonts w:ascii="Cascadia Mono" w:hAnsi="Cascadia Mono" w:cs="Cascadia Mono"/>
+          <w:color w:val="000000"/>
+          <w:sz w:val="28"/>
+          <w:szCs w:val="28"/>
+          <w:highlight w:val="white"/>
+          <w:lang w:val="en-US"/>
+        </w:rPr>
+        <w:t xml:space="preserve"> </w:t>
       </w:r>
       <w:r>
         <w:rPr>
@@ -14333,7 +15094,31 @@
           <w:highlight w:val="white"/>
           <w:lang w:val="en-US"/>
         </w:rPr>
-        <w:t>"mC: "</w:t>
+        <w:t>"</w:t>
+      </w:r>
+      <w:proofErr w:type="spellStart"/>
+      <w:r>
+        <w:rPr>
+          <w:rFonts w:ascii="Cascadia Mono" w:hAnsi="Cascadia Mono" w:cs="Cascadia Mono"/>
+          <w:color w:val="A31515"/>
+          <w:sz w:val="28"/>
+          <w:szCs w:val="28"/>
+          <w:highlight w:val="white"/>
+          <w:lang w:val="en-US"/>
+        </w:rPr>
+        <w:t>mC</w:t>
+      </w:r>
+      <w:proofErr w:type="spellEnd"/>
+      <w:r>
+        <w:rPr>
+          <w:rFonts w:ascii="Cascadia Mono" w:hAnsi="Cascadia Mono" w:cs="Cascadia Mono"/>
+          <w:color w:val="A31515"/>
+          <w:sz w:val="28"/>
+          <w:szCs w:val="28"/>
+          <w:highlight w:val="white"/>
+          <w:lang w:val="en-US"/>
+        </w:rPr>
+        <w:t>: "</w:t>
       </w:r>
       <w:r>
         <w:rPr>
@@ -14432,7 +15217,31 @@
           <w:highlight w:val="white"/>
           <w:lang w:val="en-US"/>
         </w:rPr>
-        <w:t xml:space="preserve"> endl;</w:t>
+        <w:t xml:space="preserve"> </w:t>
+      </w:r>
+      <w:proofErr w:type="spellStart"/>
+      <w:r>
+        <w:rPr>
+          <w:rFonts w:ascii="Cascadia Mono" w:hAnsi="Cascadia Mono" w:cs="Cascadia Mono"/>
+          <w:color w:val="000000"/>
+          <w:sz w:val="28"/>
+          <w:szCs w:val="28"/>
+          <w:highlight w:val="white"/>
+          <w:lang w:val="en-US"/>
+        </w:rPr>
+        <w:t>endl</w:t>
+      </w:r>
+      <w:proofErr w:type="spellEnd"/>
+      <w:r>
+        <w:rPr>
+          <w:rFonts w:ascii="Cascadia Mono" w:hAnsi="Cascadia Mono" w:cs="Cascadia Mono"/>
+          <w:color w:val="000000"/>
+          <w:sz w:val="28"/>
+          <w:szCs w:val="28"/>
+          <w:highlight w:val="white"/>
+          <w:lang w:val="en-US"/>
+        </w:rPr>
+        <w:t>;</w:t>
       </w:r>
     </w:p>
     <w:p>
@@ -14535,7 +15344,31 @@
           <w:highlight w:val="white"/>
           <w:lang w:val="en-US"/>
         </w:rPr>
-        <w:t xml:space="preserve">        cout </w:t>
+        <w:t xml:space="preserve">        </w:t>
+      </w:r>
+      <w:proofErr w:type="spellStart"/>
+      <w:r>
+        <w:rPr>
+          <w:rFonts w:ascii="Cascadia Mono" w:hAnsi="Cascadia Mono" w:cs="Cascadia Mono"/>
+          <w:color w:val="000000"/>
+          <w:sz w:val="28"/>
+          <w:szCs w:val="28"/>
+          <w:highlight w:val="white"/>
+          <w:lang w:val="en-US"/>
+        </w:rPr>
+        <w:t>cout</w:t>
+      </w:r>
+      <w:proofErr w:type="spellEnd"/>
+      <w:r>
+        <w:rPr>
+          <w:rFonts w:ascii="Cascadia Mono" w:hAnsi="Cascadia Mono" w:cs="Cascadia Mono"/>
+          <w:color w:val="000000"/>
+          <w:sz w:val="28"/>
+          <w:szCs w:val="28"/>
+          <w:highlight w:val="white"/>
+          <w:lang w:val="en-US"/>
+        </w:rPr>
+        <w:t xml:space="preserve"> </w:t>
       </w:r>
       <w:r>
         <w:rPr>
@@ -14568,7 +15401,31 @@
           <w:highlight w:val="white"/>
           <w:lang w:val="en-US"/>
         </w:rPr>
-        <w:t>"mC: "</w:t>
+        <w:t>"</w:t>
+      </w:r>
+      <w:proofErr w:type="spellStart"/>
+      <w:r>
+        <w:rPr>
+          <w:rFonts w:ascii="Cascadia Mono" w:hAnsi="Cascadia Mono" w:cs="Cascadia Mono"/>
+          <w:color w:val="A31515"/>
+          <w:sz w:val="28"/>
+          <w:szCs w:val="28"/>
+          <w:highlight w:val="white"/>
+          <w:lang w:val="en-US"/>
+        </w:rPr>
+        <w:t>mC</w:t>
+      </w:r>
+      <w:proofErr w:type="spellEnd"/>
+      <w:r>
+        <w:rPr>
+          <w:rFonts w:ascii="Cascadia Mono" w:hAnsi="Cascadia Mono" w:cs="Cascadia Mono"/>
+          <w:color w:val="A31515"/>
+          <w:sz w:val="28"/>
+          <w:szCs w:val="28"/>
+          <w:highlight w:val="white"/>
+          <w:lang w:val="en-US"/>
+        </w:rPr>
+        <w:t>: "</w:t>
       </w:r>
       <w:r>
         <w:rPr>
@@ -14647,6 +15504,7 @@
         </w:rPr>
         <w:t xml:space="preserve"> </w:t>
       </w:r>
+      <w:proofErr w:type="spellStart"/>
       <w:r>
         <w:rPr>
           <w:rFonts w:ascii="Cascadia Mono" w:hAnsi="Cascadia Mono" w:cs="Cascadia Mono"/>
@@ -14658,6 +15516,7 @@
         </w:rPr>
         <w:t>bitset</w:t>
       </w:r>
+      <w:proofErr w:type="spellEnd"/>
       <w:r>
         <w:rPr>
           <w:rFonts w:ascii="Cascadia Mono" w:hAnsi="Cascadia Mono" w:cs="Cascadia Mono"/>
@@ -14689,7 +15548,31 @@
           <w:highlight w:val="white"/>
           <w:lang w:val="en-US"/>
         </w:rPr>
-        <w:t xml:space="preserve"> endl;</w:t>
+        <w:t xml:space="preserve"> </w:t>
+      </w:r>
+      <w:proofErr w:type="spellStart"/>
+      <w:r>
+        <w:rPr>
+          <w:rFonts w:ascii="Cascadia Mono" w:hAnsi="Cascadia Mono" w:cs="Cascadia Mono"/>
+          <w:color w:val="000000"/>
+          <w:sz w:val="28"/>
+          <w:szCs w:val="28"/>
+          <w:highlight w:val="white"/>
+          <w:lang w:val="en-US"/>
+        </w:rPr>
+        <w:t>endl</w:t>
+      </w:r>
+      <w:proofErr w:type="spellEnd"/>
+      <w:r>
+        <w:rPr>
+          <w:rFonts w:ascii="Cascadia Mono" w:hAnsi="Cascadia Mono" w:cs="Cascadia Mono"/>
+          <w:color w:val="000000"/>
+          <w:sz w:val="28"/>
+          <w:szCs w:val="28"/>
+          <w:highlight w:val="white"/>
+          <w:lang w:val="en-US"/>
+        </w:rPr>
+        <w:t>;</w:t>
       </w:r>
     </w:p>
     <w:p>
@@ -14743,7 +15626,31 @@
           <w:highlight w:val="white"/>
           <w:lang w:val="en-US"/>
         </w:rPr>
-        <w:t xml:space="preserve">    cout </w:t>
+        <w:t xml:space="preserve">    </w:t>
+      </w:r>
+      <w:proofErr w:type="spellStart"/>
+      <w:r>
+        <w:rPr>
+          <w:rFonts w:ascii="Cascadia Mono" w:hAnsi="Cascadia Mono" w:cs="Cascadia Mono"/>
+          <w:color w:val="000000"/>
+          <w:sz w:val="28"/>
+          <w:szCs w:val="28"/>
+          <w:highlight w:val="white"/>
+          <w:lang w:val="en-US"/>
+        </w:rPr>
+        <w:t>cout</w:t>
+      </w:r>
+      <w:proofErr w:type="spellEnd"/>
+      <w:r>
+        <w:rPr>
+          <w:rFonts w:ascii="Cascadia Mono" w:hAnsi="Cascadia Mono" w:cs="Cascadia Mono"/>
+          <w:color w:val="000000"/>
+          <w:sz w:val="28"/>
+          <w:szCs w:val="28"/>
+          <w:highlight w:val="white"/>
+          <w:lang w:val="en-US"/>
+        </w:rPr>
+        <w:t xml:space="preserve"> </w:t>
       </w:r>
       <w:r>
         <w:rPr>
@@ -14776,7 +15683,31 @@
           <w:highlight w:val="white"/>
           <w:lang w:val="en-US"/>
         </w:rPr>
-        <w:t>"pC: "</w:t>
+        <w:t>"</w:t>
+      </w:r>
+      <w:proofErr w:type="spellStart"/>
+      <w:r>
+        <w:rPr>
+          <w:rFonts w:ascii="Cascadia Mono" w:hAnsi="Cascadia Mono" w:cs="Cascadia Mono"/>
+          <w:color w:val="A31515"/>
+          <w:sz w:val="28"/>
+          <w:szCs w:val="28"/>
+          <w:highlight w:val="white"/>
+          <w:lang w:val="en-US"/>
+        </w:rPr>
+        <w:t>pC</w:t>
+      </w:r>
+      <w:proofErr w:type="spellEnd"/>
+      <w:r>
+        <w:rPr>
+          <w:rFonts w:ascii="Cascadia Mono" w:hAnsi="Cascadia Mono" w:cs="Cascadia Mono"/>
+          <w:color w:val="A31515"/>
+          <w:sz w:val="28"/>
+          <w:szCs w:val="28"/>
+          <w:highlight w:val="white"/>
+          <w:lang w:val="en-US"/>
+        </w:rPr>
+        <w:t>: "</w:t>
       </w:r>
       <w:r>
         <w:rPr>
@@ -14811,6 +15742,7 @@
         </w:rPr>
         <w:t xml:space="preserve"> </w:t>
       </w:r>
+      <w:proofErr w:type="spellStart"/>
       <w:r>
         <w:rPr>
           <w:rFonts w:ascii="Cascadia Mono" w:hAnsi="Cascadia Mono" w:cs="Cascadia Mono"/>
@@ -14822,16 +15754,41 @@
         </w:rPr>
         <w:t>bitset</w:t>
       </w:r>
-      <w:r>
-        <w:rPr>
-          <w:rFonts w:ascii="Cascadia Mono" w:hAnsi="Cascadia Mono" w:cs="Cascadia Mono"/>
-          <w:color w:val="000000"/>
-          <w:sz w:val="28"/>
-          <w:szCs w:val="28"/>
-          <w:highlight w:val="white"/>
-          <w:lang w:val="en-US"/>
-        </w:rPr>
-        <w:t>&lt;5&gt;(pC);</w:t>
+      <w:proofErr w:type="spellEnd"/>
+      <w:r>
+        <w:rPr>
+          <w:rFonts w:ascii="Cascadia Mono" w:hAnsi="Cascadia Mono" w:cs="Cascadia Mono"/>
+          <w:color w:val="000000"/>
+          <w:sz w:val="28"/>
+          <w:szCs w:val="28"/>
+          <w:highlight w:val="white"/>
+          <w:lang w:val="en-US"/>
+        </w:rPr>
+        <w:t>&lt;5&gt;(</w:t>
+      </w:r>
+      <w:proofErr w:type="spellStart"/>
+      <w:r>
+        <w:rPr>
+          <w:rFonts w:ascii="Cascadia Mono" w:hAnsi="Cascadia Mono" w:cs="Cascadia Mono"/>
+          <w:color w:val="000000"/>
+          <w:sz w:val="28"/>
+          <w:szCs w:val="28"/>
+          <w:highlight w:val="white"/>
+          <w:lang w:val="en-US"/>
+        </w:rPr>
+        <w:t>pC</w:t>
+      </w:r>
+      <w:proofErr w:type="spellEnd"/>
+      <w:r>
+        <w:rPr>
+          <w:rFonts w:ascii="Cascadia Mono" w:hAnsi="Cascadia Mono" w:cs="Cascadia Mono"/>
+          <w:color w:val="000000"/>
+          <w:sz w:val="28"/>
+          <w:szCs w:val="28"/>
+          <w:highlight w:val="white"/>
+          <w:lang w:val="en-US"/>
+        </w:rPr>
+        <w:t>);</w:t>
       </w:r>
     </w:p>
     <w:p>
@@ -14911,17 +15868,15 @@
           <w:sz w:val="28"/>
           <w:szCs w:val="28"/>
           <w:highlight w:val="white"/>
-          <w:lang w:val="en-US"/>
-        </w:rPr>
-      </w:pPr>
-      <w:r>
-        <w:rPr>
-          <w:rFonts w:ascii="Cascadia Mono" w:hAnsi="Cascadia Mono" w:cs="Cascadia Mono"/>
-          <w:color w:val="000000"/>
-          <w:sz w:val="28"/>
-          <w:szCs w:val="28"/>
-          <w:highlight w:val="white"/>
-          <w:lang w:val="en-US"/>
+        </w:rPr>
+      </w:pPr>
+      <w:r>
+        <w:rPr>
+          <w:rFonts w:ascii="Cascadia Mono" w:hAnsi="Cascadia Mono" w:cs="Cascadia Mono"/>
+          <w:color w:val="000000"/>
+          <w:sz w:val="28"/>
+          <w:szCs w:val="28"/>
+          <w:highlight w:val="white"/>
         </w:rPr>
         <w:t>}</w:t>
       </w:r>
@@ -14932,15 +15887,13 @@
           <w:rFonts w:ascii="Times New Roman" w:hAnsi="Times New Roman" w:cs="Times New Roman"/>
           <w:sz w:val="28"/>
           <w:szCs w:val="28"/>
-          <w:lang w:val="en-US"/>
-        </w:rPr>
-      </w:pPr>
-      <w:r>
-        <w:rPr>
-          <w:rFonts w:ascii="Times New Roman" w:hAnsi="Times New Roman" w:cs="Times New Roman"/>
-          <w:sz w:val="28"/>
-          <w:szCs w:val="28"/>
-          <w:lang w:val="en-US"/>
+        </w:rPr>
+      </w:pPr>
+      <w:r>
+        <w:rPr>
+          <w:rFonts w:ascii="Times New Roman" w:hAnsi="Times New Roman" w:cs="Times New Roman"/>
+          <w:sz w:val="28"/>
+          <w:szCs w:val="28"/>
         </w:rPr>
         <w:br w:type="page"/>
       </w:r>
@@ -15965,6 +16918,7 @@
   <w:style w:type="character" w:default="1" w:styleId="a0">
     <w:name w:val="Default Paragraph Font"/>
     <w:uiPriority w:val="1"/>
+    <w:semiHidden/>
     <w:unhideWhenUsed/>
   </w:style>
   <w:style w:type="table" w:default="1" w:styleId="a1">

</xml_diff>